<commit_message>
Update Django module and add PDF export
Updated the '6. Modul 6 - Django.docx' document and added a PDF version in the export directory for easier distribution and access.
</commit_message>
<xml_diff>
--- a/6. Modul 6 - Django.docx
+++ b/6. Modul 6 - Django.docx
@@ -241,7 +241,7 @@
         <w:rPr>
           <w:rFonts w:ascii="Calibri" w:hAnsi="Calibri" w:cs="Calibri"/>
         </w:rPr>
-        <w:t>Membuat dan menjalankan proyek Django baru serta memahami struktur direktori dasarnya.</w:t>
+        <w:t>Membuat dan menjalankan proyek Django serta memahami struktur direktori dasarnya.</w:t>
       </w:r>
     </w:p>
     <w:p>
@@ -361,15 +361,6 @@
     </w:p>
     <w:p>
       <w:pPr>
-        <w:spacing w:before="100" w:beforeAutospacing="1" w:after="100" w:afterAutospacing="1"/>
-        <w:jc w:val="both"/>
-        <w:rPr>
-          <w:rFonts w:ascii="Calibri" w:hAnsi="Calibri" w:cs="Calibri"/>
-        </w:rPr>
-      </w:pPr>
-    </w:p>
-    <w:p>
-      <w:pPr>
         <w:pStyle w:val="ListParagraph"/>
         <w:numPr>
           <w:ilvl w:val="1"/>
@@ -389,6 +380,7 @@
           <w:b/>
           <w:bCs/>
         </w:rPr>
+        <w:lastRenderedPageBreak/>
         <w:t xml:space="preserve">Pengantar </w:t>
       </w:r>
     </w:p>
@@ -491,7 +483,7 @@
         <w:rPr>
           <w:rFonts w:ascii="Calibri" w:hAnsi="Calibri" w:cs="Calibri"/>
         </w:rPr>
-        <w:t xml:space="preserve"> yang mengikuti pola arsitektur Model-View-Template (MVT). Filosofi utamanya adalah "batteries-included", yang berarti Django menyediakan hampir semua yang dibutuhkan pengembang secara </w:t>
+        <w:t xml:space="preserve"> yang mengikuti pola arsitektur </w:t>
       </w:r>
       <w:r>
         <w:rPr>
@@ -499,13 +491,55 @@
           <w:i/>
           <w:iCs/>
         </w:rPr>
+        <w:t>Model-View-Template</w:t>
+      </w:r>
+      <w:r>
+        <w:rPr>
+          <w:rFonts w:ascii="Calibri" w:hAnsi="Calibri" w:cs="Calibri"/>
+        </w:rPr>
+        <w:t xml:space="preserve"> (MVT). Filosofi utamanya adalah "</w:t>
+      </w:r>
+      <w:r>
+        <w:rPr>
+          <w:rFonts w:ascii="Calibri" w:hAnsi="Calibri" w:cs="Calibri"/>
+          <w:i/>
+          <w:iCs/>
+        </w:rPr>
+        <w:t>batteries-included</w:t>
+      </w:r>
+      <w:r>
+        <w:rPr>
+          <w:rFonts w:ascii="Calibri" w:hAnsi="Calibri" w:cs="Calibri"/>
+        </w:rPr>
+        <w:t xml:space="preserve">", yang berarti Django menyediakan hampir semua yang dibutuhkan pengembang secara </w:t>
+      </w:r>
+      <w:r>
+        <w:rPr>
+          <w:rFonts w:ascii="Calibri" w:hAnsi="Calibri" w:cs="Calibri"/>
+          <w:i/>
+          <w:iCs/>
+        </w:rPr>
         <w:t>out-of-the-box</w:t>
       </w:r>
       <w:r>
         <w:rPr>
           <w:rFonts w:ascii="Calibri" w:hAnsi="Calibri" w:cs="Calibri"/>
         </w:rPr>
-        <w:t xml:space="preserve">, mulai dari sistem autentikasi, panel admin, hingga ORM (Object-Relational Mapper) yang kuat. </w:t>
+        <w:t>, mulai dari sistem autentikasi, panel admin, hingga ORM (</w:t>
+      </w:r>
+      <w:r>
+        <w:rPr>
+          <w:rFonts w:ascii="Calibri" w:hAnsi="Calibri" w:cs="Calibri"/>
+          <w:i/>
+          <w:iCs/>
+        </w:rPr>
+        <w:t>Object-Relational Mapper</w:t>
+      </w:r>
+      <w:r>
+        <w:rPr>
+          <w:rFonts w:ascii="Calibri" w:hAnsi="Calibri" w:cs="Calibri"/>
+        </w:rPr>
+        <w:t xml:space="preserve">) yang kuat. </w:t>
       </w:r>
       <w:bookmarkStart w:id="1" w:name="_Hlk208372867"/>
     </w:p>
@@ -521,6 +555,8 @@
         <w:rPr>
           <w:rStyle w:val="selected"/>
           <w:rFonts w:ascii="Calibri" w:hAnsi="Calibri" w:cs="Calibri"/>
+          <w:i/>
+          <w:iCs/>
           <w:sz w:val="24"/>
           <w:szCs w:val="24"/>
         </w:rPr>
@@ -528,6 +564,8 @@
       <w:r>
         <w:rPr>
           <w:rFonts w:ascii="Calibri" w:hAnsi="Calibri" w:cs="Calibri"/>
+          <w:i/>
+          <w:iCs/>
           <w:sz w:val="24"/>
           <w:szCs w:val="24"/>
         </w:rPr>
@@ -631,20 +669,26 @@
           <w:iCs w:val="0"/>
           <w:color w:val="auto"/>
         </w:rPr>
-        <w:t>Masalahnya, kalau semua orang simpan bahan makanan di sana, resep jadi campur aduk: ada orang yang butuh garam versi organik, ada yang butuh garam meja biasa, ada yang butuh gula aren.</w:t>
-      </w:r>
-    </w:p>
-    <w:p>
-      <w:pPr>
-        <w:pStyle w:val="Heading4"/>
-        <w:jc w:val="both"/>
+        <w:t xml:space="preserve">Masalahnya, kalau semua orang simpan bahan makanan di sana, </w:t>
+      </w:r>
+      <w:r>
         <w:rPr>
           <w:rFonts w:ascii="Calibri" w:hAnsi="Calibri" w:cs="Calibri"/>
           <w:i w:val="0"/>
           <w:iCs w:val="0"/>
           <w:color w:val="auto"/>
         </w:rPr>
-      </w:pPr>
+        <w:t>bahan makanan</w:t>
+      </w:r>
+      <w:r>
+        <w:rPr>
+          <w:rFonts w:ascii="Calibri" w:hAnsi="Calibri" w:cs="Calibri"/>
+          <w:i w:val="0"/>
+          <w:iCs w:val="0"/>
+          <w:color w:val="auto"/>
+        </w:rPr>
+        <w:t xml:space="preserve"> jadi campur aduk: ada orang yang butuh garam versi organik, ada yang butuh garam meja biasa, ada yang butuh gula aren.</w:t>
+      </w:r>
       <w:r>
         <w:rPr>
           <w:rFonts w:ascii="Calibri" w:hAnsi="Calibri" w:cs="Calibri"/>
@@ -704,6 +748,7 @@
           <w:numId w:val="155"/>
         </w:numPr>
         <w:ind w:left="709"/>
+        <w:jc w:val="both"/>
         <w:rPr>
           <w:rFonts w:ascii="Calibri" w:hAnsi="Calibri" w:cs="Calibri"/>
           <w:sz w:val="24"/>
@@ -722,6 +767,7 @@
     <w:p>
       <w:pPr>
         <w:spacing w:before="100" w:beforeAutospacing="1" w:after="100" w:afterAutospacing="1"/>
+        <w:jc w:val="both"/>
         <w:rPr>
           <w:rFonts w:ascii="Calibri" w:hAnsi="Calibri" w:cs="Calibri"/>
         </w:rPr>
@@ -770,6 +816,7 @@
           <w:numId w:val="156"/>
         </w:numPr>
         <w:spacing w:before="100" w:beforeAutospacing="1" w:after="100" w:afterAutospacing="1"/>
+        <w:jc w:val="both"/>
         <w:rPr>
           <w:rFonts w:ascii="Calibri" w:hAnsi="Calibri" w:cs="Calibri"/>
         </w:rPr>
@@ -811,6 +858,7 @@
           <w:numId w:val="156"/>
         </w:numPr>
         <w:spacing w:before="100" w:beforeAutospacing="1" w:after="100" w:afterAutospacing="1"/>
+        <w:jc w:val="both"/>
       </w:pPr>
       <w:r>
         <w:t>Direktori Proyek Utama (</w:t>
@@ -843,6 +891,7 @@
           <w:numId w:val="156"/>
         </w:numPr>
         <w:spacing w:before="100" w:beforeAutospacing="1" w:after="100" w:afterAutospacing="1"/>
+        <w:jc w:val="both"/>
         <w:rPr>
           <w:rFonts w:ascii="Calibri" w:hAnsi="Calibri" w:cs="Calibri"/>
         </w:rPr>
@@ -872,6 +921,7 @@
           <w:numId w:val="156"/>
         </w:numPr>
         <w:spacing w:before="100" w:beforeAutospacing="1" w:after="100" w:afterAutospacing="1"/>
+        <w:jc w:val="both"/>
       </w:pPr>
       <w:r>
         <w:rPr>
@@ -932,6 +982,7 @@
           <w:numId w:val="156"/>
         </w:numPr>
         <w:spacing w:before="100" w:beforeAutospacing="1" w:after="100" w:afterAutospacing="1"/>
+        <w:jc w:val="both"/>
       </w:pPr>
       <w:r>
         <w:rPr>
@@ -951,6 +1002,9 @@
         <w:t>Titik masuk untuk server web yang kompatibel dengan WSGI untuk melayani proyek.</w:t>
       </w:r>
     </w:p>
+    <w:p/>
+    <w:p/>
+    <w:p/>
     <w:p/>
     <w:p>
       <w:pPr>
@@ -1034,7 +1088,21 @@
         <w:rPr>
           <w:rFonts w:ascii="Calibri" w:hAnsi="Calibri" w:cs="Calibri"/>
         </w:rPr>
-        <w:t xml:space="preserve">Django dilengkapi dengan Object-Relational Mapper (ORM), yang merupakan jembatan antara kode Python yang </w:t>
+        <w:t xml:space="preserve">Django dilengkapi dengan </w:t>
+      </w:r>
+      <w:r>
+        <w:rPr>
+          <w:rFonts w:ascii="Calibri" w:hAnsi="Calibri" w:cs="Calibri"/>
+          <w:i/>
+          <w:iCs/>
+        </w:rPr>
+        <w:t xml:space="preserve">Object-Relational Mapper </w:t>
+      </w:r>
+      <w:r>
+        <w:rPr>
+          <w:rFonts w:ascii="Calibri" w:hAnsi="Calibri" w:cs="Calibri"/>
+        </w:rPr>
+        <w:t xml:space="preserve">(ORM), yang merupakan jembatan antara kode Python yang </w:t>
       </w:r>
       <w:r>
         <w:rPr>
@@ -1794,6 +1862,51 @@
     </w:p>
     <w:p>
       <w:pPr>
+        <w:spacing w:before="100" w:beforeAutospacing="1" w:after="100" w:afterAutospacing="1"/>
+        <w:jc w:val="both"/>
+        <w:rPr>
+          <w:rFonts w:ascii="Calibri" w:hAnsi="Calibri" w:cs="Calibri"/>
+        </w:rPr>
+      </w:pPr>
+    </w:p>
+    <w:p>
+      <w:pPr>
+        <w:spacing w:before="100" w:beforeAutospacing="1" w:after="100" w:afterAutospacing="1"/>
+        <w:jc w:val="both"/>
+        <w:rPr>
+          <w:rFonts w:ascii="Calibri" w:hAnsi="Calibri" w:cs="Calibri"/>
+        </w:rPr>
+      </w:pPr>
+    </w:p>
+    <w:p>
+      <w:pPr>
+        <w:spacing w:before="100" w:beforeAutospacing="1" w:after="100" w:afterAutospacing="1"/>
+        <w:jc w:val="both"/>
+        <w:rPr>
+          <w:rFonts w:ascii="Calibri" w:hAnsi="Calibri" w:cs="Calibri"/>
+        </w:rPr>
+      </w:pPr>
+    </w:p>
+    <w:p>
+      <w:pPr>
+        <w:spacing w:before="100" w:beforeAutospacing="1" w:after="100" w:afterAutospacing="1"/>
+        <w:jc w:val="both"/>
+        <w:rPr>
+          <w:rFonts w:ascii="Calibri" w:hAnsi="Calibri" w:cs="Calibri"/>
+        </w:rPr>
+      </w:pPr>
+    </w:p>
+    <w:p>
+      <w:pPr>
+        <w:spacing w:before="100" w:beforeAutospacing="1" w:after="100" w:afterAutospacing="1"/>
+        <w:jc w:val="both"/>
+        <w:rPr>
+          <w:rFonts w:ascii="Calibri" w:hAnsi="Calibri" w:cs="Calibri"/>
+        </w:rPr>
+      </w:pPr>
+    </w:p>
+    <w:p>
+      <w:pPr>
         <w:pStyle w:val="ListParagraph"/>
         <w:numPr>
           <w:ilvl w:val="1"/>
@@ -1812,6 +1925,7 @@
           <w:b/>
           <w:bCs/>
         </w:rPr>
+        <w:lastRenderedPageBreak/>
         <w:t>Kegiatan Praktikum</w:t>
       </w:r>
       <w:r>
@@ -1834,6 +1948,7 @@
     </w:p>
     <w:p>
       <w:pPr>
+        <w:spacing w:line="276" w:lineRule="auto"/>
         <w:jc w:val="both"/>
         <w:rPr>
           <w:rFonts w:ascii="Calibri" w:hAnsi="Calibri" w:cs="Calibri"/>
@@ -1860,6 +1975,7 @@
     </w:p>
     <w:p>
       <w:pPr>
+        <w:spacing w:line="276" w:lineRule="auto"/>
         <w:jc w:val="both"/>
         <w:rPr>
           <w:rFonts w:ascii="Calibri" w:hAnsi="Calibri" w:cs="Calibri"/>
@@ -1889,6 +2005,7 @@
     </w:p>
     <w:p>
       <w:pPr>
+        <w:spacing w:line="276" w:lineRule="auto"/>
         <w:jc w:val="both"/>
         <w:rPr>
           <w:rFonts w:ascii="Calibri" w:hAnsi="Calibri" w:cs="Calibri"/>
@@ -1903,6 +2020,7 @@
     </w:p>
     <w:p>
       <w:pPr>
+        <w:spacing w:line="276" w:lineRule="auto"/>
         <w:jc w:val="both"/>
         <w:rPr>
           <w:rFonts w:ascii="Calibri" w:hAnsi="Calibri" w:cs="Calibri"/>
@@ -1911,6 +2029,7 @@
     </w:p>
     <w:p>
       <w:pPr>
+        <w:spacing w:line="276" w:lineRule="auto"/>
         <w:jc w:val="both"/>
         <w:rPr>
           <w:rFonts w:ascii="Calibri" w:hAnsi="Calibri" w:cs="Calibri"/>
@@ -1934,6 +2053,7 @@
           <w:ilvl w:val="2"/>
           <w:numId w:val="156"/>
         </w:numPr>
+        <w:spacing w:line="276" w:lineRule="auto"/>
         <w:ind w:left="426"/>
         <w:jc w:val="both"/>
       </w:pPr>
@@ -1941,7 +2061,6 @@
         <w:rPr>
           <w:rFonts w:ascii="Calibri" w:hAnsi="Calibri" w:cs="Calibri"/>
         </w:rPr>
-        <w:lastRenderedPageBreak/>
         <w:t xml:space="preserve">Buat sebuah folder baru untuk kegiatan praktikum </w:t>
       </w:r>
       <w:r>
@@ -2013,6 +2132,7 @@
           <w:ilvl w:val="2"/>
           <w:numId w:val="156"/>
         </w:numPr>
+        <w:spacing w:line="276" w:lineRule="auto"/>
         <w:ind w:left="426"/>
         <w:jc w:val="both"/>
         <w:rPr>
@@ -2603,6 +2723,7 @@
           <w:ilvl w:val="0"/>
           <w:numId w:val="162"/>
         </w:numPr>
+        <w:jc w:val="both"/>
       </w:pPr>
       <w:r>
         <w:rPr>
@@ -2938,6 +3059,7 @@
         <w:rPr>
           <w:rStyle w:val="selected"/>
         </w:rPr>
+        <w:lastRenderedPageBreak/>
         <w:t>Jalankan server django untuk pertama kalinya.</w:t>
       </w:r>
     </w:p>
@@ -3096,11 +3218,13 @@
         <w:jc w:val="center"/>
       </w:pPr>
       <w:r>
-        <w:lastRenderedPageBreak/>
+        <w:rPr>
+          <w:noProof/>
+        </w:rPr>
         <w:drawing>
-          <wp:inline distT="0" distB="0" distL="0" distR="0" wp14:anchorId="5AA09152" wp14:editId="7891F62D">
-            <wp:extent cx="2981325" cy="2753745"/>
-            <wp:effectExtent l="76200" t="76200" r="123825" b="142240"/>
+          <wp:inline distT="0" distB="0" distL="0" distR="0" wp14:anchorId="5AA09152" wp14:editId="1628742C">
+            <wp:extent cx="3352529" cy="3096613"/>
+            <wp:effectExtent l="63500" t="63500" r="127635" b="129540"/>
             <wp:docPr id="1108281389" name="Picture 1" descr="A screenshot of a computer&#10;&#10;AI-generated content may be incorrect."/>
             <wp:cNvGraphicFramePr>
               <a:graphicFrameLocks xmlns:a="http://schemas.openxmlformats.org/drawingml/2006/main" noChangeAspect="1"/>
@@ -3121,7 +3245,7 @@
                   <pic:spPr>
                     <a:xfrm>
                       <a:off x="0" y="0"/>
-                      <a:ext cx="2987200" cy="2759172"/>
+                      <a:ext cx="3372256" cy="3114834"/>
                     </a:xfrm>
                     <a:prstGeom prst="rect">
                       <a:avLst/>
@@ -3200,6 +3324,7 @@
           <w:ilvl w:val="0"/>
           <w:numId w:val="166"/>
         </w:numPr>
+        <w:jc w:val="both"/>
       </w:pPr>
       <w:r>
         <w:rPr>
@@ -4001,11 +4126,81 @@
         <w:t>]</w:t>
       </w:r>
     </w:p>
+    <w:p/>
     <w:p>
       <w:pPr>
+        <w:jc w:val="both"/>
+        <w:rPr>
+          <w:rFonts w:ascii="Calibri" w:hAnsi="Calibri" w:cs="Calibri"/>
+          <w:b/>
+          <w:bCs/>
+        </w:rPr>
+      </w:pPr>
+      <w:r>
+        <w:rPr>
+          <w:rFonts w:ascii="Calibri" w:hAnsi="Calibri" w:cs="Calibri"/>
+          <w:b/>
+          <w:bCs/>
+        </w:rPr>
+        <w:t>Langkah 5: Membuat Model Post</w:t>
+      </w:r>
+    </w:p>
+    <w:p>
+      <w:pPr>
+        <w:jc w:val="both"/>
+        <w:rPr>
+          <w:rFonts w:ascii="Calibri" w:hAnsi="Calibri" w:cs="Calibri"/>
+        </w:rPr>
+      </w:pPr>
+    </w:p>
+    <w:p>
+      <w:pPr>
+        <w:pStyle w:val="ListParagraph"/>
         <w:numPr>
           <w:ilvl w:val="0"/>
-          <w:numId w:val="168"/>
+          <w:numId w:val="169"/>
+        </w:numPr>
+        <w:jc w:val="both"/>
+      </w:pPr>
+      <w:r>
+        <w:t xml:space="preserve">Buka file </w:t>
+      </w:r>
+      <w:r>
+        <w:rPr>
+          <w:rFonts w:ascii="Courier New" w:hAnsi="Courier New" w:cs="Courier New"/>
+          <w:sz w:val="20"/>
+          <w:szCs w:val="20"/>
+        </w:rPr>
+        <w:t>blog/models.py</w:t>
+      </w:r>
+      <w:r>
+        <w:t>. Hapus konten default dan definisikan model untuk postingan blog.</w:t>
+      </w:r>
+    </w:p>
+    <w:p>
+      <w:pPr>
+        <w:jc w:val="both"/>
+      </w:pPr>
+    </w:p>
+    <w:p>
+      <w:pPr>
+        <w:ind w:firstLine="360"/>
+        <w:jc w:val="both"/>
+      </w:pPr>
+      <w:r>
+        <w:rPr>
+          <w:rFonts w:ascii="Courier New" w:hAnsi="Courier New" w:cs="Courier New"/>
+          <w:sz w:val="20"/>
+          <w:szCs w:val="20"/>
+        </w:rPr>
+        <w:t>blog/models.py</w:t>
+      </w:r>
+    </w:p>
+    <w:p>
+      <w:pPr>
+        <w:numPr>
+          <w:ilvl w:val="0"/>
+          <w:numId w:val="170"/>
         </w:numPr>
         <w:pBdr>
           <w:left w:val="single" w:sz="18" w:space="0" w:color="6CE26C"/>
@@ -4039,75 +4234,41 @@
           <w:szCs w:val="21"/>
         </w:rPr>
       </w:pPr>
-    </w:p>
-    <w:p/>
-    <w:p>
-      <w:pPr>
-        <w:jc w:val="both"/>
-        <w:rPr>
-          <w:rFonts w:ascii="Calibri" w:hAnsi="Calibri" w:cs="Calibri"/>
-          <w:b/>
-          <w:bCs/>
-        </w:rPr>
-      </w:pPr>
-      <w:r>
-        <w:rPr>
-          <w:rFonts w:ascii="Calibri" w:hAnsi="Calibri" w:cs="Calibri"/>
-          <w:b/>
-          <w:bCs/>
-        </w:rPr>
-        <w:t>Langkah 5: Membuat Model Post</w:t>
-      </w:r>
-    </w:p>
-    <w:p>
-      <w:pPr>
-        <w:jc w:val="both"/>
-        <w:rPr>
-          <w:rFonts w:ascii="Calibri" w:hAnsi="Calibri" w:cs="Calibri"/>
-        </w:rPr>
-      </w:pPr>
-    </w:p>
-    <w:p>
-      <w:pPr>
-        <w:pStyle w:val="ListParagraph"/>
-        <w:numPr>
-          <w:ilvl w:val="0"/>
-          <w:numId w:val="169"/>
-        </w:numPr>
-        <w:jc w:val="both"/>
-      </w:pPr>
-      <w:r>
-        <w:t xml:space="preserve">Buka file </w:t>
-      </w:r>
-      <w:r>
-        <w:rPr>
-          <w:rFonts w:ascii="Courier New" w:hAnsi="Courier New" w:cs="Courier New"/>
-          <w:sz w:val="20"/>
-          <w:szCs w:val="20"/>
-        </w:rPr>
-        <w:t>blog/models.py</w:t>
-      </w:r>
-      <w:r>
-        <w:t>. Hapus konten default dan definisikan model untuk postingan blog.</w:t>
-      </w:r>
-    </w:p>
-    <w:p>
-      <w:pPr>
-        <w:jc w:val="both"/>
-      </w:pPr>
-    </w:p>
-    <w:p>
-      <w:pPr>
-        <w:ind w:firstLine="360"/>
-        <w:jc w:val="both"/>
-      </w:pPr>
-      <w:r>
-        <w:rPr>
-          <w:rFonts w:ascii="Courier New" w:hAnsi="Courier New" w:cs="Courier New"/>
-          <w:sz w:val="20"/>
-          <w:szCs w:val="20"/>
-        </w:rPr>
-        <w:t>blog/models.py</w:t>
+      <w:r>
+        <w:rPr>
+          <w:rFonts w:ascii="Consolas" w:hAnsi="Consolas" w:cs="Consolas"/>
+          <w:color w:val="A626A4"/>
+          <w:sz w:val="21"/>
+          <w:szCs w:val="21"/>
+        </w:rPr>
+        <w:t>from</w:t>
+      </w:r>
+      <w:r>
+        <w:rPr>
+          <w:rFonts w:ascii="Consolas" w:hAnsi="Consolas" w:cs="Consolas"/>
+          <w:color w:val="5C5C5C"/>
+          <w:sz w:val="21"/>
+          <w:szCs w:val="21"/>
+        </w:rPr>
+        <w:t> django.conf </w:t>
+      </w:r>
+      <w:r>
+        <w:rPr>
+          <w:rFonts w:ascii="Consolas" w:hAnsi="Consolas" w:cs="Consolas"/>
+          <w:color w:val="A626A4"/>
+          <w:sz w:val="21"/>
+          <w:szCs w:val="21"/>
+        </w:rPr>
+        <w:t>import</w:t>
+      </w:r>
+      <w:r>
+        <w:rPr>
+          <w:rFonts w:ascii="Consolas" w:hAnsi="Consolas" w:cs="Consolas"/>
+          <w:color w:val="5C5C5C"/>
+          <w:sz w:val="21"/>
+          <w:szCs w:val="21"/>
+        </w:rPr>
+        <w:t> settings</w:t>
       </w:r>
     </w:p>
     <w:p>
@@ -4119,7 +4280,7 @@
         <w:pBdr>
           <w:left w:val="single" w:sz="18" w:space="0" w:color="6CE26C"/>
         </w:pBdr>
-        <w:shd w:val="clear" w:color="auto" w:fill="FAFAFA"/>
+        <w:shd w:val="clear" w:color="auto" w:fill="F8F8F8"/>
         <w:tabs>
           <w:tab w:val="clear" w:pos="720"/>
           <w:tab w:val="left" w:pos="916"/>
@@ -4164,7 +4325,7 @@
           <w:sz w:val="21"/>
           <w:szCs w:val="21"/>
         </w:rPr>
-        <w:t> django.conf </w:t>
+        <w:t> django.db </w:t>
       </w:r>
       <w:r>
         <w:rPr>
@@ -4182,7 +4343,7 @@
           <w:sz w:val="21"/>
           <w:szCs w:val="21"/>
         </w:rPr>
-        <w:t> settings</w:t>
+        <w:t> models</w:t>
       </w:r>
     </w:p>
     <w:p>
@@ -4194,7 +4355,7 @@
         <w:pBdr>
           <w:left w:val="single" w:sz="18" w:space="0" w:color="6CE26C"/>
         </w:pBdr>
-        <w:shd w:val="clear" w:color="auto" w:fill="F8F8F8"/>
+        <w:shd w:val="clear" w:color="auto" w:fill="FAFAFA"/>
         <w:tabs>
           <w:tab w:val="clear" w:pos="720"/>
           <w:tab w:val="left" w:pos="916"/>
@@ -4239,7 +4400,7 @@
           <w:sz w:val="21"/>
           <w:szCs w:val="21"/>
         </w:rPr>
-        <w:t> django.db </w:t>
+        <w:t> django.utils </w:t>
       </w:r>
       <w:r>
         <w:rPr>
@@ -4257,7 +4418,7 @@
           <w:sz w:val="21"/>
           <w:szCs w:val="21"/>
         </w:rPr>
-        <w:t> models</w:t>
+        <w:t> timezone</w:t>
       </w:r>
     </w:p>
     <w:p>
@@ -4269,7 +4430,7 @@
         <w:pBdr>
           <w:left w:val="single" w:sz="18" w:space="0" w:color="6CE26C"/>
         </w:pBdr>
-        <w:shd w:val="clear" w:color="auto" w:fill="FAFAFA"/>
+        <w:shd w:val="clear" w:color="auto" w:fill="F8F8F8"/>
         <w:tabs>
           <w:tab w:val="clear" w:pos="720"/>
           <w:tab w:val="left" w:pos="916"/>
@@ -4298,43 +4459,6 @@
           <w:szCs w:val="21"/>
         </w:rPr>
       </w:pPr>
-      <w:r>
-        <w:rPr>
-          <w:rFonts w:ascii="Consolas" w:hAnsi="Consolas" w:cs="Consolas"/>
-          <w:color w:val="A626A4"/>
-          <w:sz w:val="21"/>
-          <w:szCs w:val="21"/>
-        </w:rPr>
-        <w:lastRenderedPageBreak/>
-        <w:t>from</w:t>
-      </w:r>
-      <w:r>
-        <w:rPr>
-          <w:rFonts w:ascii="Consolas" w:hAnsi="Consolas" w:cs="Consolas"/>
-          <w:color w:val="5C5C5C"/>
-          <w:sz w:val="21"/>
-          <w:szCs w:val="21"/>
-        </w:rPr>
-        <w:t> django.utils </w:t>
-      </w:r>
-      <w:r>
-        <w:rPr>
-          <w:rFonts w:ascii="Consolas" w:hAnsi="Consolas" w:cs="Consolas"/>
-          <w:color w:val="A626A4"/>
-          <w:sz w:val="21"/>
-          <w:szCs w:val="21"/>
-        </w:rPr>
-        <w:t>import</w:t>
-      </w:r>
-      <w:r>
-        <w:rPr>
-          <w:rFonts w:ascii="Consolas" w:hAnsi="Consolas" w:cs="Consolas"/>
-          <w:color w:val="5C5C5C"/>
-          <w:sz w:val="21"/>
-          <w:szCs w:val="21"/>
-        </w:rPr>
-        <w:t> timezone</w:t>
-      </w:r>
     </w:p>
     <w:p>
       <w:pPr>
@@ -4345,7 +4469,7 @@
         <w:pBdr>
           <w:left w:val="single" w:sz="18" w:space="0" w:color="6CE26C"/>
         </w:pBdr>
-        <w:shd w:val="clear" w:color="auto" w:fill="F8F8F8"/>
+        <w:shd w:val="clear" w:color="auto" w:fill="FAFAFA"/>
         <w:tabs>
           <w:tab w:val="clear" w:pos="720"/>
           <w:tab w:val="left" w:pos="916"/>
@@ -4374,6 +4498,24 @@
           <w:szCs w:val="21"/>
         </w:rPr>
       </w:pPr>
+      <w:r>
+        <w:rPr>
+          <w:rFonts w:ascii="Consolas" w:hAnsi="Consolas" w:cs="Consolas"/>
+          <w:color w:val="A626A4"/>
+          <w:sz w:val="21"/>
+          <w:szCs w:val="21"/>
+        </w:rPr>
+        <w:t>class</w:t>
+      </w:r>
+      <w:r>
+        <w:rPr>
+          <w:rFonts w:ascii="Consolas" w:hAnsi="Consolas" w:cs="Consolas"/>
+          <w:color w:val="5C5C5C"/>
+          <w:sz w:val="21"/>
+          <w:szCs w:val="21"/>
+        </w:rPr>
+        <w:t> Post(models.Model):</w:t>
+      </w:r>
     </w:p>
     <w:p>
       <w:pPr>
@@ -4384,7 +4526,7 @@
         <w:pBdr>
           <w:left w:val="single" w:sz="18" w:space="0" w:color="6CE26C"/>
         </w:pBdr>
-        <w:shd w:val="clear" w:color="auto" w:fill="FAFAFA"/>
+        <w:shd w:val="clear" w:color="auto" w:fill="F8F8F8"/>
         <w:tabs>
           <w:tab w:val="clear" w:pos="720"/>
           <w:tab w:val="left" w:pos="916"/>
@@ -4416,20 +4558,11 @@
       <w:r>
         <w:rPr>
           <w:rFonts w:ascii="Consolas" w:hAnsi="Consolas" w:cs="Consolas"/>
-          <w:color w:val="A626A4"/>
-          <w:sz w:val="21"/>
-          <w:szCs w:val="21"/>
-        </w:rPr>
-        <w:t>class</w:t>
-      </w:r>
-      <w:r>
-        <w:rPr>
-          <w:rFonts w:ascii="Consolas" w:hAnsi="Consolas" w:cs="Consolas"/>
           <w:color w:val="5C5C5C"/>
           <w:sz w:val="21"/>
           <w:szCs w:val="21"/>
         </w:rPr>
-        <w:t> Post(models.Model):</w:t>
+        <w:t>    author = models.ForeignKey(settings.AUTH_USER_MODEL, on_delete=models.CASCADE)</w:t>
       </w:r>
     </w:p>
     <w:p>
@@ -4441,7 +4574,7 @@
         <w:pBdr>
           <w:left w:val="single" w:sz="18" w:space="0" w:color="6CE26C"/>
         </w:pBdr>
-        <w:shd w:val="clear" w:color="auto" w:fill="F8F8F8"/>
+        <w:shd w:val="clear" w:color="auto" w:fill="FAFAFA"/>
         <w:tabs>
           <w:tab w:val="clear" w:pos="720"/>
           <w:tab w:val="left" w:pos="916"/>
@@ -4477,7 +4610,25 @@
           <w:sz w:val="21"/>
           <w:szCs w:val="21"/>
         </w:rPr>
-        <w:t>    author = models.ForeignKey(settings.AUTH_USER_MODEL, on_delete=models.CASCADE)</w:t>
+        <w:t>    title = models.CharField(max_length=</w:t>
+      </w:r>
+      <w:r>
+        <w:rPr>
+          <w:rFonts w:ascii="Consolas" w:hAnsi="Consolas" w:cs="Consolas"/>
+          <w:color w:val="986801"/>
+          <w:sz w:val="21"/>
+          <w:szCs w:val="21"/>
+        </w:rPr>
+        <w:t>200</w:t>
+      </w:r>
+      <w:r>
+        <w:rPr>
+          <w:rFonts w:ascii="Consolas" w:hAnsi="Consolas" w:cs="Consolas"/>
+          <w:color w:val="5C5C5C"/>
+          <w:sz w:val="21"/>
+          <w:szCs w:val="21"/>
+        </w:rPr>
+        <w:t>)</w:t>
       </w:r>
     </w:p>
     <w:p>
@@ -4489,7 +4640,7 @@
         <w:pBdr>
           <w:left w:val="single" w:sz="18" w:space="0" w:color="6CE26C"/>
         </w:pBdr>
-        <w:shd w:val="clear" w:color="auto" w:fill="FAFAFA"/>
+        <w:shd w:val="clear" w:color="auto" w:fill="F8F8F8"/>
         <w:tabs>
           <w:tab w:val="clear" w:pos="720"/>
           <w:tab w:val="left" w:pos="916"/>
@@ -4525,25 +4676,7 @@
           <w:sz w:val="21"/>
           <w:szCs w:val="21"/>
         </w:rPr>
-        <w:t>    title = models.CharField(max_length=</w:t>
-      </w:r>
-      <w:r>
-        <w:rPr>
-          <w:rFonts w:ascii="Consolas" w:hAnsi="Consolas" w:cs="Consolas"/>
-          <w:color w:val="986801"/>
-          <w:sz w:val="21"/>
-          <w:szCs w:val="21"/>
-        </w:rPr>
-        <w:t>200</w:t>
-      </w:r>
-      <w:r>
-        <w:rPr>
-          <w:rFonts w:ascii="Consolas" w:hAnsi="Consolas" w:cs="Consolas"/>
-          <w:color w:val="5C5C5C"/>
-          <w:sz w:val="21"/>
-          <w:szCs w:val="21"/>
-        </w:rPr>
-        <w:t>)</w:t>
+        <w:t>    text = models.TextField()</w:t>
       </w:r>
     </w:p>
     <w:p>
@@ -4555,7 +4688,7 @@
         <w:pBdr>
           <w:left w:val="single" w:sz="18" w:space="0" w:color="6CE26C"/>
         </w:pBdr>
-        <w:shd w:val="clear" w:color="auto" w:fill="F8F8F8"/>
+        <w:shd w:val="clear" w:color="auto" w:fill="FAFAFA"/>
         <w:tabs>
           <w:tab w:val="clear" w:pos="720"/>
           <w:tab w:val="left" w:pos="916"/>
@@ -4591,7 +4724,7 @@
           <w:sz w:val="21"/>
           <w:szCs w:val="21"/>
         </w:rPr>
-        <w:t>    text = models.TextField()</w:t>
+        <w:t>    created_date = models.DateTimeField(default=timezone.now)</w:t>
       </w:r>
     </w:p>
     <w:p>
@@ -4603,7 +4736,7 @@
         <w:pBdr>
           <w:left w:val="single" w:sz="18" w:space="0" w:color="6CE26C"/>
         </w:pBdr>
-        <w:shd w:val="clear" w:color="auto" w:fill="FAFAFA"/>
+        <w:shd w:val="clear" w:color="auto" w:fill="F8F8F8"/>
         <w:tabs>
           <w:tab w:val="clear" w:pos="720"/>
           <w:tab w:val="left" w:pos="916"/>
@@ -4639,7 +4772,43 @@
           <w:sz w:val="21"/>
           <w:szCs w:val="21"/>
         </w:rPr>
-        <w:t>    created_date = models.DateTimeField(default=timezone.now)</w:t>
+        <w:t>    published_date = models.DateTimeField(blank=</w:t>
+      </w:r>
+      <w:r>
+        <w:rPr>
+          <w:rFonts w:ascii="Consolas" w:hAnsi="Consolas" w:cs="Consolas"/>
+          <w:color w:val="0184BB"/>
+          <w:sz w:val="21"/>
+          <w:szCs w:val="21"/>
+        </w:rPr>
+        <w:t>True</w:t>
+      </w:r>
+      <w:r>
+        <w:rPr>
+          <w:rFonts w:ascii="Consolas" w:hAnsi="Consolas" w:cs="Consolas"/>
+          <w:color w:val="5C5C5C"/>
+          <w:sz w:val="21"/>
+          <w:szCs w:val="21"/>
+        </w:rPr>
+        <w:t>, null=</w:t>
+      </w:r>
+      <w:r>
+        <w:rPr>
+          <w:rFonts w:ascii="Consolas" w:hAnsi="Consolas" w:cs="Consolas"/>
+          <w:color w:val="0184BB"/>
+          <w:sz w:val="21"/>
+          <w:szCs w:val="21"/>
+        </w:rPr>
+        <w:t>True</w:t>
+      </w:r>
+      <w:r>
+        <w:rPr>
+          <w:rFonts w:ascii="Consolas" w:hAnsi="Consolas" w:cs="Consolas"/>
+          <w:color w:val="5C5C5C"/>
+          <w:sz w:val="21"/>
+          <w:szCs w:val="21"/>
+        </w:rPr>
+        <w:t>)</w:t>
       </w:r>
     </w:p>
     <w:p>
@@ -4651,7 +4820,7 @@
         <w:pBdr>
           <w:left w:val="single" w:sz="18" w:space="0" w:color="6CE26C"/>
         </w:pBdr>
-        <w:shd w:val="clear" w:color="auto" w:fill="F8F8F8"/>
+        <w:shd w:val="clear" w:color="auto" w:fill="FAFAFA"/>
         <w:tabs>
           <w:tab w:val="clear" w:pos="720"/>
           <w:tab w:val="left" w:pos="916"/>
@@ -4680,51 +4849,6 @@
           <w:szCs w:val="21"/>
         </w:rPr>
       </w:pPr>
-      <w:r>
-        <w:rPr>
-          <w:rFonts w:ascii="Consolas" w:hAnsi="Consolas" w:cs="Consolas"/>
-          <w:color w:val="5C5C5C"/>
-          <w:sz w:val="21"/>
-          <w:szCs w:val="21"/>
-        </w:rPr>
-        <w:t>    published_date = models.DateTimeField(blank=</w:t>
-      </w:r>
-      <w:r>
-        <w:rPr>
-          <w:rFonts w:ascii="Consolas" w:hAnsi="Consolas" w:cs="Consolas"/>
-          <w:color w:val="0184BB"/>
-          <w:sz w:val="21"/>
-          <w:szCs w:val="21"/>
-        </w:rPr>
-        <w:t>True</w:t>
-      </w:r>
-      <w:r>
-        <w:rPr>
-          <w:rFonts w:ascii="Consolas" w:hAnsi="Consolas" w:cs="Consolas"/>
-          <w:color w:val="5C5C5C"/>
-          <w:sz w:val="21"/>
-          <w:szCs w:val="21"/>
-        </w:rPr>
-        <w:t>, null=</w:t>
-      </w:r>
-      <w:r>
-        <w:rPr>
-          <w:rFonts w:ascii="Consolas" w:hAnsi="Consolas" w:cs="Consolas"/>
-          <w:color w:val="0184BB"/>
-          <w:sz w:val="21"/>
-          <w:szCs w:val="21"/>
-        </w:rPr>
-        <w:t>True</w:t>
-      </w:r>
-      <w:r>
-        <w:rPr>
-          <w:rFonts w:ascii="Consolas" w:hAnsi="Consolas" w:cs="Consolas"/>
-          <w:color w:val="5C5C5C"/>
-          <w:sz w:val="21"/>
-          <w:szCs w:val="21"/>
-        </w:rPr>
-        <w:t>)</w:t>
-      </w:r>
     </w:p>
     <w:p>
       <w:pPr>
@@ -4735,7 +4859,7 @@
         <w:pBdr>
           <w:left w:val="single" w:sz="18" w:space="0" w:color="6CE26C"/>
         </w:pBdr>
-        <w:shd w:val="clear" w:color="auto" w:fill="FAFAFA"/>
+        <w:shd w:val="clear" w:color="auto" w:fill="F8F8F8"/>
         <w:tabs>
           <w:tab w:val="clear" w:pos="720"/>
           <w:tab w:val="left" w:pos="916"/>
@@ -4764,6 +4888,33 @@
           <w:szCs w:val="21"/>
         </w:rPr>
       </w:pPr>
+      <w:r>
+        <w:rPr>
+          <w:rFonts w:ascii="Consolas" w:hAnsi="Consolas" w:cs="Consolas"/>
+          <w:color w:val="5C5C5C"/>
+          <w:sz w:val="21"/>
+          <w:szCs w:val="21"/>
+        </w:rPr>
+        <w:t>    </w:t>
+      </w:r>
+      <w:r>
+        <w:rPr>
+          <w:rFonts w:ascii="Consolas" w:hAnsi="Consolas" w:cs="Consolas"/>
+          <w:color w:val="A626A4"/>
+          <w:sz w:val="21"/>
+          <w:szCs w:val="21"/>
+        </w:rPr>
+        <w:t>def</w:t>
+      </w:r>
+      <w:r>
+        <w:rPr>
+          <w:rFonts w:ascii="Consolas" w:hAnsi="Consolas" w:cs="Consolas"/>
+          <w:color w:val="5C5C5C"/>
+          <w:sz w:val="21"/>
+          <w:szCs w:val="21"/>
+        </w:rPr>
+        <w:t> publish(self):</w:t>
+      </w:r>
     </w:p>
     <w:p>
       <w:pPr>
@@ -4774,7 +4925,7 @@
         <w:pBdr>
           <w:left w:val="single" w:sz="18" w:space="0" w:color="6CE26C"/>
         </w:pBdr>
-        <w:shd w:val="clear" w:color="auto" w:fill="F8F8F8"/>
+        <w:shd w:val="clear" w:color="auto" w:fill="FAFAFA"/>
         <w:tabs>
           <w:tab w:val="clear" w:pos="720"/>
           <w:tab w:val="left" w:pos="916"/>
@@ -4810,25 +4961,7 @@
           <w:sz w:val="21"/>
           <w:szCs w:val="21"/>
         </w:rPr>
-        <w:t>    </w:t>
-      </w:r>
-      <w:r>
-        <w:rPr>
-          <w:rFonts w:ascii="Consolas" w:hAnsi="Consolas" w:cs="Consolas"/>
-          <w:color w:val="A626A4"/>
-          <w:sz w:val="21"/>
-          <w:szCs w:val="21"/>
-        </w:rPr>
-        <w:t>def</w:t>
-      </w:r>
-      <w:r>
-        <w:rPr>
-          <w:rFonts w:ascii="Consolas" w:hAnsi="Consolas" w:cs="Consolas"/>
-          <w:color w:val="5C5C5C"/>
-          <w:sz w:val="21"/>
-          <w:szCs w:val="21"/>
-        </w:rPr>
-        <w:t> publish(self):</w:t>
+        <w:t>        self.published_date = timezone.now()</w:t>
       </w:r>
     </w:p>
     <w:p>
@@ -4840,7 +4973,7 @@
         <w:pBdr>
           <w:left w:val="single" w:sz="18" w:space="0" w:color="6CE26C"/>
         </w:pBdr>
-        <w:shd w:val="clear" w:color="auto" w:fill="FAFAFA"/>
+        <w:shd w:val="clear" w:color="auto" w:fill="F8F8F8"/>
         <w:tabs>
           <w:tab w:val="clear" w:pos="720"/>
           <w:tab w:val="left" w:pos="916"/>
@@ -4876,7 +5009,7 @@
           <w:sz w:val="21"/>
           <w:szCs w:val="21"/>
         </w:rPr>
-        <w:t>        self.published_date = timezone.now()</w:t>
+        <w:t>        self.save()</w:t>
       </w:r>
     </w:p>
     <w:p>
@@ -4888,7 +5021,7 @@
         <w:pBdr>
           <w:left w:val="single" w:sz="18" w:space="0" w:color="6CE26C"/>
         </w:pBdr>
-        <w:shd w:val="clear" w:color="auto" w:fill="F8F8F8"/>
+        <w:shd w:val="clear" w:color="auto" w:fill="FAFAFA"/>
         <w:tabs>
           <w:tab w:val="clear" w:pos="720"/>
           <w:tab w:val="left" w:pos="916"/>
@@ -4917,15 +5050,6 @@
           <w:szCs w:val="21"/>
         </w:rPr>
       </w:pPr>
-      <w:r>
-        <w:rPr>
-          <w:rFonts w:ascii="Consolas" w:hAnsi="Consolas" w:cs="Consolas"/>
-          <w:color w:val="5C5C5C"/>
-          <w:sz w:val="21"/>
-          <w:szCs w:val="21"/>
-        </w:rPr>
-        <w:t>        self.save()</w:t>
-      </w:r>
     </w:p>
     <w:p>
       <w:pPr>
@@ -4936,7 +5060,7 @@
         <w:pBdr>
           <w:left w:val="single" w:sz="18" w:space="0" w:color="6CE26C"/>
         </w:pBdr>
-        <w:shd w:val="clear" w:color="auto" w:fill="FAFAFA"/>
+        <w:shd w:val="clear" w:color="auto" w:fill="F8F8F8"/>
         <w:tabs>
           <w:tab w:val="clear" w:pos="720"/>
           <w:tab w:val="left" w:pos="916"/>
@@ -4965,6 +5089,33 @@
           <w:szCs w:val="21"/>
         </w:rPr>
       </w:pPr>
+      <w:r>
+        <w:rPr>
+          <w:rFonts w:ascii="Consolas" w:hAnsi="Consolas" w:cs="Consolas"/>
+          <w:color w:val="5C5C5C"/>
+          <w:sz w:val="21"/>
+          <w:szCs w:val="21"/>
+        </w:rPr>
+        <w:t>    </w:t>
+      </w:r>
+      <w:r>
+        <w:rPr>
+          <w:rFonts w:ascii="Consolas" w:hAnsi="Consolas" w:cs="Consolas"/>
+          <w:color w:val="A626A4"/>
+          <w:sz w:val="21"/>
+          <w:szCs w:val="21"/>
+        </w:rPr>
+        <w:t>def</w:t>
+      </w:r>
+      <w:r>
+        <w:rPr>
+          <w:rFonts w:ascii="Consolas" w:hAnsi="Consolas" w:cs="Consolas"/>
+          <w:color w:val="5C5C5C"/>
+          <w:sz w:val="21"/>
+          <w:szCs w:val="21"/>
+        </w:rPr>
+        <w:t> __str__(self):</w:t>
+      </w:r>
     </w:p>
     <w:p>
       <w:pPr>
@@ -4975,7 +5126,7 @@
         <w:pBdr>
           <w:left w:val="single" w:sz="18" w:space="0" w:color="6CE26C"/>
         </w:pBdr>
-        <w:shd w:val="clear" w:color="auto" w:fill="F8F8F8"/>
+        <w:shd w:val="clear" w:color="auto" w:fill="FAFAFA"/>
         <w:tabs>
           <w:tab w:val="clear" w:pos="720"/>
           <w:tab w:val="left" w:pos="916"/>
@@ -5011,7 +5162,7 @@
           <w:sz w:val="21"/>
           <w:szCs w:val="21"/>
         </w:rPr>
-        <w:t>    </w:t>
+        <w:t>        </w:t>
       </w:r>
       <w:r>
         <w:rPr>
@@ -5020,7 +5171,7 @@
           <w:sz w:val="21"/>
           <w:szCs w:val="21"/>
         </w:rPr>
-        <w:t>def</w:t>
+        <w:t>return</w:t>
       </w:r>
       <w:r>
         <w:rPr>
@@ -5029,14 +5180,330 @@
           <w:sz w:val="21"/>
           <w:szCs w:val="21"/>
         </w:rPr>
-        <w:t> __str__(self):</w:t>
+        <w:t> self.title</w:t>
+      </w:r>
+    </w:p>
+    <w:p/>
+    <w:p>
+      <w:pPr>
+        <w:pStyle w:val="NormalWeb"/>
+        <w:ind w:left="426"/>
+        <w:rPr>
+          <w:rFonts w:ascii="Calibri" w:hAnsi="Calibri" w:cs="Calibri"/>
+        </w:rPr>
+      </w:pPr>
+      <w:r>
+        <w:rPr>
+          <w:rFonts w:ascii="Calibri" w:hAnsi="Calibri" w:cs="Calibri"/>
+        </w:rPr>
+        <w:t>Model</w:t>
+      </w:r>
+      <w:r>
+        <w:t xml:space="preserve"> </w:t>
+      </w:r>
+      <w:r>
+        <w:rPr>
+          <w:rStyle w:val="HTMLCode"/>
+        </w:rPr>
+        <w:t>Post</w:t>
+      </w:r>
+      <w:r>
+        <w:t xml:space="preserve"> </w:t>
+      </w:r>
+      <w:r>
+        <w:rPr>
+          <w:rFonts w:ascii="Calibri" w:hAnsi="Calibri" w:cs="Calibri"/>
+        </w:rPr>
+        <w:t>ini berisi atribut:</w:t>
       </w:r>
     </w:p>
     <w:p>
       <w:pPr>
+        <w:pStyle w:val="NormalWeb"/>
         <w:numPr>
           <w:ilvl w:val="0"/>
-          <w:numId w:val="170"/>
+          <w:numId w:val="179"/>
+        </w:numPr>
+        <w:ind w:left="851"/>
+      </w:pPr>
+      <w:r>
+        <w:rPr>
+          <w:rFonts w:ascii="Calibri" w:hAnsi="Calibri" w:cs="Calibri"/>
+        </w:rPr>
+        <w:t>Penulis</w:t>
+      </w:r>
+      <w:r>
+        <w:t xml:space="preserve"> (</w:t>
+      </w:r>
+      <w:r>
+        <w:rPr>
+          <w:rStyle w:val="HTMLCode"/>
+        </w:rPr>
+        <w:t>author</w:t>
+      </w:r>
+      <w:r>
+        <w:t>)</w:t>
+      </w:r>
+    </w:p>
+    <w:p>
+      <w:pPr>
+        <w:pStyle w:val="NormalWeb"/>
+        <w:numPr>
+          <w:ilvl w:val="0"/>
+          <w:numId w:val="179"/>
+        </w:numPr>
+        <w:ind w:left="851"/>
+      </w:pPr>
+      <w:r>
+        <w:rPr>
+          <w:rFonts w:ascii="Calibri" w:hAnsi="Calibri" w:cs="Calibri"/>
+        </w:rPr>
+        <w:t>Judul</w:t>
+      </w:r>
+      <w:r>
+        <w:t xml:space="preserve"> (</w:t>
+      </w:r>
+      <w:r>
+        <w:rPr>
+          <w:rStyle w:val="HTMLCode"/>
+        </w:rPr>
+        <w:t>title</w:t>
+      </w:r>
+      <w:r>
+        <w:t>)</w:t>
+      </w:r>
+    </w:p>
+    <w:p>
+      <w:pPr>
+        <w:pStyle w:val="NormalWeb"/>
+        <w:numPr>
+          <w:ilvl w:val="0"/>
+          <w:numId w:val="179"/>
+        </w:numPr>
+        <w:ind w:left="851"/>
+      </w:pPr>
+      <w:r>
+        <w:rPr>
+          <w:rFonts w:ascii="Calibri" w:hAnsi="Calibri" w:cs="Calibri"/>
+        </w:rPr>
+        <w:t>Isi</w:t>
+      </w:r>
+      <w:r>
+        <w:t xml:space="preserve"> (</w:t>
+      </w:r>
+      <w:r>
+        <w:rPr>
+          <w:rStyle w:val="HTMLCode"/>
+        </w:rPr>
+        <w:t>text</w:t>
+      </w:r>
+      <w:r>
+        <w:t>)</w:t>
+      </w:r>
+    </w:p>
+    <w:p>
+      <w:pPr>
+        <w:pStyle w:val="NormalWeb"/>
+        <w:numPr>
+          <w:ilvl w:val="0"/>
+          <w:numId w:val="179"/>
+        </w:numPr>
+        <w:ind w:left="851"/>
+      </w:pPr>
+      <w:r>
+        <w:rPr>
+          <w:rFonts w:ascii="Calibri" w:hAnsi="Calibri" w:cs="Calibri"/>
+        </w:rPr>
+        <w:t>Tanggal dibuat</w:t>
+      </w:r>
+      <w:r>
+        <w:t xml:space="preserve"> (</w:t>
+      </w:r>
+      <w:r>
+        <w:rPr>
+          <w:rStyle w:val="HTMLCode"/>
+        </w:rPr>
+        <w:t>created_date</w:t>
+      </w:r>
+      <w:r>
+        <w:t>)</w:t>
+      </w:r>
+    </w:p>
+    <w:p>
+      <w:pPr>
+        <w:pStyle w:val="NormalWeb"/>
+        <w:numPr>
+          <w:ilvl w:val="0"/>
+          <w:numId w:val="179"/>
+        </w:numPr>
+        <w:ind w:left="851"/>
+      </w:pPr>
+      <w:r>
+        <w:rPr>
+          <w:rFonts w:ascii="Calibri" w:hAnsi="Calibri" w:cs="Calibri"/>
+        </w:rPr>
+        <w:t>Tanggal dipublish</w:t>
+      </w:r>
+      <w:r>
+        <w:t xml:space="preserve"> (</w:t>
+      </w:r>
+      <w:r>
+        <w:rPr>
+          <w:rStyle w:val="HTMLCode"/>
+        </w:rPr>
+        <w:t>published_date</w:t>
+      </w:r>
+      <w:r>
+        <w:t>)</w:t>
+      </w:r>
+    </w:p>
+    <w:p>
+      <w:pPr>
+        <w:pStyle w:val="NormalWeb"/>
+        <w:ind w:left="426"/>
+        <w:rPr>
+          <w:rFonts w:ascii="Calibri" w:hAnsi="Calibri" w:cs="Calibri"/>
+        </w:rPr>
+      </w:pPr>
+      <w:r>
+        <w:rPr>
+          <w:rFonts w:ascii="Calibri" w:hAnsi="Calibri" w:cs="Calibri"/>
+        </w:rPr>
+        <w:t>Selain itu ada dua method:</w:t>
+      </w:r>
+    </w:p>
+    <w:p>
+      <w:pPr>
+        <w:pStyle w:val="NormalWeb"/>
+        <w:numPr>
+          <w:ilvl w:val="0"/>
+          <w:numId w:val="180"/>
+        </w:numPr>
+        <w:ind w:left="851"/>
+        <w:rPr>
+          <w:rFonts w:ascii="Calibri" w:hAnsi="Calibri" w:cs="Calibri"/>
+        </w:rPr>
+      </w:pPr>
+      <w:r>
+        <w:rPr>
+          <w:rStyle w:val="HTMLCode"/>
+        </w:rPr>
+        <w:t>publish()</w:t>
+      </w:r>
+      <w:r>
+        <w:t xml:space="preserve"> → </w:t>
+      </w:r>
+      <w:r>
+        <w:rPr>
+          <w:rFonts w:ascii="Calibri" w:hAnsi="Calibri" w:cs="Calibri"/>
+        </w:rPr>
+        <w:t>untuk mempublish post.</w:t>
+      </w:r>
+    </w:p>
+    <w:p>
+      <w:pPr>
+        <w:pStyle w:val="NormalWeb"/>
+        <w:numPr>
+          <w:ilvl w:val="0"/>
+          <w:numId w:val="180"/>
+        </w:numPr>
+        <w:ind w:left="851"/>
+        <w:rPr>
+          <w:rFonts w:ascii="Calibri" w:hAnsi="Calibri" w:cs="Calibri"/>
+        </w:rPr>
+      </w:pPr>
+      <w:r>
+        <w:rPr>
+          <w:rStyle w:val="HTMLCode"/>
+        </w:rPr>
+        <w:t>__str__()</w:t>
+      </w:r>
+      <w:r>
+        <w:t xml:space="preserve"> → </w:t>
+      </w:r>
+      <w:r>
+        <w:rPr>
+          <w:rFonts w:ascii="Calibri" w:hAnsi="Calibri" w:cs="Calibri"/>
+        </w:rPr>
+        <w:t>untuk menampilkan judul ketika objek dipanggil sebagai string.</w:t>
+      </w:r>
+    </w:p>
+    <w:p/>
+    <w:p>
+      <w:pPr>
+        <w:pStyle w:val="Heading4"/>
+        <w:rPr>
+          <w:b/>
+          <w:bCs/>
+          <w:i w:val="0"/>
+          <w:iCs w:val="0"/>
+          <w:color w:val="auto"/>
+        </w:rPr>
+      </w:pPr>
+      <w:r>
+        <w:rPr>
+          <w:rStyle w:val="selected"/>
+          <w:b/>
+          <w:bCs/>
+          <w:i w:val="0"/>
+          <w:iCs w:val="0"/>
+          <w:color w:val="auto"/>
+        </w:rPr>
+        <w:t>Langkah 6: Membuat dan Menjalankan Migrasi</w:t>
+      </w:r>
+    </w:p>
+    <w:p>
+      <w:pPr>
+        <w:pStyle w:val="NormalWeb"/>
+        <w:numPr>
+          <w:ilvl w:val="0"/>
+          <w:numId w:val="171"/>
+        </w:numPr>
+      </w:pPr>
+      <w:r>
+        <w:rPr>
+          <w:rStyle w:val="selected"/>
+        </w:rPr>
+        <w:t xml:space="preserve">Setelah model didefinisikan, </w:t>
+      </w:r>
+      <w:r>
+        <w:rPr>
+          <w:rStyle w:val="selected"/>
+        </w:rPr>
+        <w:t>gunakan perintah ini</w:t>
+      </w:r>
+      <w:r>
+        <w:rPr>
+          <w:rStyle w:val="selected"/>
+        </w:rPr>
+        <w:t xml:space="preserve"> untuk membuat file migrasi.</w:t>
+      </w:r>
+    </w:p>
+    <w:p>
+      <w:pPr>
+        <w:pStyle w:val="ListParagraph"/>
+        <w:jc w:val="both"/>
+        <w:rPr>
+          <w:rStyle w:val="selected"/>
+          <w:rFonts w:ascii="Courier New" w:hAnsi="Courier New" w:cs="Courier New"/>
+          <w:sz w:val="22"/>
+          <w:szCs w:val="22"/>
+        </w:rPr>
+      </w:pPr>
+      <w:r>
+        <w:rPr>
+          <w:rFonts w:ascii="Courier New" w:hAnsi="Courier New" w:cs="Courier New"/>
+          <w:sz w:val="22"/>
+          <w:szCs w:val="22"/>
+        </w:rPr>
+        <w:t>Terminal</w:t>
+      </w:r>
+    </w:p>
+    <w:p>
+      <w:pPr>
+        <w:numPr>
+          <w:ilvl w:val="0"/>
+          <w:numId w:val="173"/>
         </w:numPr>
         <w:pBdr>
           <w:left w:val="single" w:sz="18" w:space="0" w:color="6CE26C"/>
@@ -5077,273 +5544,141 @@
           <w:sz w:val="21"/>
           <w:szCs w:val="21"/>
         </w:rPr>
-        <w:t>        </w:t>
-      </w:r>
-      <w:r>
-        <w:rPr>
-          <w:rFonts w:ascii="Consolas" w:hAnsi="Consolas" w:cs="Consolas"/>
-          <w:color w:val="A626A4"/>
-          <w:sz w:val="21"/>
-          <w:szCs w:val="21"/>
-        </w:rPr>
-        <w:t>return</w:t>
-      </w:r>
-      <w:r>
+        <w:t>python manage.py makemigrations blog</w:t>
+      </w:r>
+    </w:p>
+    <w:p>
+      <w:pPr>
+        <w:pStyle w:val="NormalWeb"/>
+        <w:ind w:left="720"/>
+        <w:rPr>
+          <w:rStyle w:val="selected"/>
+          <w:rFonts w:ascii="Times New Roman" w:hAnsi="Times New Roman"/>
+        </w:rPr>
+      </w:pPr>
+    </w:p>
+    <w:p>
+      <w:pPr>
+        <w:pStyle w:val="NormalWeb"/>
+        <w:ind w:left="720"/>
+        <w:rPr>
+          <w:rStyle w:val="selected"/>
+          <w:rFonts w:ascii="Times New Roman" w:hAnsi="Times New Roman"/>
+        </w:rPr>
+      </w:pPr>
+    </w:p>
+    <w:p>
+      <w:pPr>
+        <w:pStyle w:val="NormalWeb"/>
+        <w:numPr>
+          <w:ilvl w:val="0"/>
+          <w:numId w:val="171"/>
+        </w:numPr>
+      </w:pPr>
+      <w:r>
+        <w:rPr>
+          <w:rStyle w:val="selected"/>
+        </w:rPr>
+        <w:t>Sekarang, terapkan migrasi tersebut ke basis data.</w:t>
+      </w:r>
+    </w:p>
+    <w:p>
+      <w:pPr>
+        <w:pStyle w:val="ListParagraph"/>
+        <w:jc w:val="both"/>
+        <w:rPr>
+          <w:rFonts w:ascii="Courier New" w:hAnsi="Courier New" w:cs="Courier New"/>
+          <w:sz w:val="22"/>
+          <w:szCs w:val="22"/>
+        </w:rPr>
+      </w:pPr>
+      <w:r>
+        <w:rPr>
+          <w:rFonts w:ascii="Courier New" w:hAnsi="Courier New" w:cs="Courier New"/>
+          <w:sz w:val="22"/>
+          <w:szCs w:val="22"/>
+        </w:rPr>
+        <w:t>Terminal</w:t>
+      </w:r>
+    </w:p>
+    <w:p>
+      <w:pPr>
+        <w:numPr>
+          <w:ilvl w:val="0"/>
+          <w:numId w:val="174"/>
+        </w:numPr>
+        <w:pBdr>
+          <w:left w:val="single" w:sz="18" w:space="0" w:color="6CE26C"/>
+        </w:pBdr>
+        <w:spacing w:line="270" w:lineRule="atLeast"/>
+        <w:ind w:left="1395"/>
         <w:rPr>
           <w:rFonts w:ascii="Consolas" w:hAnsi="Consolas" w:cs="Consolas"/>
           <w:color w:val="5C5C5C"/>
           <w:sz w:val="21"/>
           <w:szCs w:val="21"/>
         </w:rPr>
-        <w:t> self.title</w:t>
-      </w:r>
-    </w:p>
-    <w:p/>
-    <w:p>
-      <w:pPr>
-        <w:pStyle w:val="NormalWeb"/>
-        <w:ind w:left="426"/>
-        <w:rPr>
-          <w:rFonts w:ascii="Calibri" w:hAnsi="Calibri" w:cs="Calibri"/>
-        </w:rPr>
-      </w:pPr>
-      <w:r>
-        <w:rPr>
-          <w:rFonts w:ascii="Calibri" w:hAnsi="Calibri" w:cs="Calibri"/>
-        </w:rPr>
-        <w:t>Model</w:t>
-      </w:r>
-      <w:r>
-        <w:t xml:space="preserve"> </w:t>
-      </w:r>
-      <w:r>
-        <w:rPr>
-          <w:rStyle w:val="HTMLCode"/>
-        </w:rPr>
-        <w:t>Post</w:t>
-      </w:r>
-      <w:r>
-        <w:t xml:space="preserve"> </w:t>
-      </w:r>
-      <w:r>
-        <w:rPr>
-          <w:rFonts w:ascii="Calibri" w:hAnsi="Calibri" w:cs="Calibri"/>
-        </w:rPr>
-        <w:t>ini berisi atribut:</w:t>
+      </w:pPr>
+      <w:r>
+        <w:rPr>
+          <w:rFonts w:ascii="Consolas" w:hAnsi="Consolas" w:cs="Consolas"/>
+          <w:color w:val="5C5C5C"/>
+          <w:sz w:val="21"/>
+          <w:szCs w:val="21"/>
+        </w:rPr>
+        <w:t>python manage.py migrate</w:t>
       </w:r>
     </w:p>
     <w:p>
       <w:pPr>
-        <w:pStyle w:val="NormalWeb"/>
-        <w:numPr>
-          <w:ilvl w:val="0"/>
-          <w:numId w:val="179"/>
-        </w:numPr>
-        <w:ind w:left="851"/>
-      </w:pPr>
-      <w:r>
-        <w:rPr>
-          <w:rFonts w:ascii="Calibri" w:hAnsi="Calibri" w:cs="Calibri"/>
-        </w:rPr>
-        <w:t>Penulis</w:t>
-      </w:r>
-      <w:r>
-        <w:t xml:space="preserve"> (</w:t>
-      </w:r>
-      <w:r>
-        <w:rPr>
-          <w:rStyle w:val="HTMLCode"/>
-        </w:rPr>
-        <w:t>author</w:t>
-      </w:r>
-      <w:r>
-        <w:t>)</w:t>
-      </w:r>
+        <w:pStyle w:val="HTMLPreformatted"/>
+        <w:ind w:left="720"/>
+      </w:pPr>
     </w:p>
     <w:p>
       <w:pPr>
         <w:pStyle w:val="NormalWeb"/>
-        <w:numPr>
-          <w:ilvl w:val="0"/>
-          <w:numId w:val="179"/>
-        </w:numPr>
-        <w:ind w:left="851"/>
-      </w:pPr>
-      <w:r>
-        <w:rPr>
-          <w:rFonts w:ascii="Calibri" w:hAnsi="Calibri" w:cs="Calibri"/>
-        </w:rPr>
-        <w:t>Judul</w:t>
-      </w:r>
-      <w:r>
-        <w:t xml:space="preserve"> (</w:t>
-      </w:r>
-      <w:r>
-        <w:rPr>
-          <w:rStyle w:val="HTMLCode"/>
-        </w:rPr>
-        <w:t>title</w:t>
-      </w:r>
-      <w:r>
-        <w:t>)</w:t>
+        <w:ind w:left="720"/>
+        <w:rPr>
+          <w:rStyle w:val="selected"/>
+          <w:i/>
+          <w:iCs/>
+        </w:rPr>
+      </w:pPr>
+      <w:r>
+        <w:rPr>
+          <w:rStyle w:val="selected"/>
+          <w:i/>
+          <w:iCs/>
+        </w:rPr>
+        <w:t>Basis data default Django adalah file SQLite yang akan dibuat otomatis (</w:t>
+      </w:r>
+      <w:r>
+        <w:rPr>
+          <w:rStyle w:val="selected"/>
+          <w:rFonts w:ascii="Courier New" w:hAnsi="Courier New" w:cs="Courier New"/>
+          <w:i/>
+          <w:iCs/>
+          <w:sz w:val="20"/>
+          <w:szCs w:val="20"/>
+        </w:rPr>
+        <w:t>db.sqlite3</w:t>
+      </w:r>
+      <w:r>
+        <w:rPr>
+          <w:rStyle w:val="selected"/>
+          <w:i/>
+          <w:iCs/>
+        </w:rPr>
+        <w:t>).</w:t>
       </w:r>
     </w:p>
     <w:p>
       <w:pPr>
         <w:pStyle w:val="NormalWeb"/>
-        <w:numPr>
-          <w:ilvl w:val="0"/>
-          <w:numId w:val="179"/>
-        </w:numPr>
-        <w:ind w:left="851"/>
-      </w:pPr>
-      <w:r>
-        <w:rPr>
-          <w:rFonts w:ascii="Calibri" w:hAnsi="Calibri" w:cs="Calibri"/>
-        </w:rPr>
-        <w:t>Isi</w:t>
-      </w:r>
-      <w:r>
-        <w:t xml:space="preserve"> (</w:t>
-      </w:r>
-      <w:r>
-        <w:rPr>
-          <w:rStyle w:val="HTMLCode"/>
-        </w:rPr>
-        <w:t>text</w:t>
-      </w:r>
-      <w:r>
-        <w:t>)</w:t>
-      </w:r>
+        <w:ind w:left="720"/>
+      </w:pPr>
     </w:p>
-    <w:p>
-      <w:pPr>
-        <w:pStyle w:val="NormalWeb"/>
-        <w:numPr>
-          <w:ilvl w:val="0"/>
-          <w:numId w:val="179"/>
-        </w:numPr>
-        <w:ind w:left="851"/>
-      </w:pPr>
-      <w:r>
-        <w:rPr>
-          <w:rFonts w:ascii="Calibri" w:hAnsi="Calibri" w:cs="Calibri"/>
-        </w:rPr>
-        <w:t>Tanggal dibuat</w:t>
-      </w:r>
-      <w:r>
-        <w:t xml:space="preserve"> (</w:t>
-      </w:r>
-      <w:r>
-        <w:rPr>
-          <w:rStyle w:val="HTMLCode"/>
-        </w:rPr>
-        <w:t>created_date</w:t>
-      </w:r>
-      <w:r>
-        <w:t>)</w:t>
-      </w:r>
-    </w:p>
-    <w:p>
-      <w:pPr>
-        <w:pStyle w:val="NormalWeb"/>
-        <w:numPr>
-          <w:ilvl w:val="0"/>
-          <w:numId w:val="179"/>
-        </w:numPr>
-        <w:ind w:left="851"/>
-      </w:pPr>
-      <w:r>
-        <w:rPr>
-          <w:rFonts w:ascii="Calibri" w:hAnsi="Calibri" w:cs="Calibri"/>
-        </w:rPr>
-        <w:t>Tanggal dipublish</w:t>
-      </w:r>
-      <w:r>
-        <w:t xml:space="preserve"> (</w:t>
-      </w:r>
-      <w:r>
-        <w:rPr>
-          <w:rStyle w:val="HTMLCode"/>
-        </w:rPr>
-        <w:t>published_date</w:t>
-      </w:r>
-      <w:r>
-        <w:t>)</w:t>
-      </w:r>
-    </w:p>
-    <w:p>
-      <w:pPr>
-        <w:pStyle w:val="NormalWeb"/>
-        <w:ind w:left="426"/>
-        <w:rPr>
-          <w:rFonts w:ascii="Calibri" w:hAnsi="Calibri" w:cs="Calibri"/>
-        </w:rPr>
-      </w:pPr>
-      <w:r>
-        <w:rPr>
-          <w:rFonts w:ascii="Calibri" w:hAnsi="Calibri" w:cs="Calibri"/>
-        </w:rPr>
-        <w:t>Selain itu ada dua method:</w:t>
-      </w:r>
-    </w:p>
-    <w:p>
-      <w:pPr>
-        <w:pStyle w:val="NormalWeb"/>
-        <w:numPr>
-          <w:ilvl w:val="0"/>
-          <w:numId w:val="180"/>
-        </w:numPr>
-        <w:ind w:left="851"/>
-        <w:rPr>
-          <w:rFonts w:ascii="Calibri" w:hAnsi="Calibri" w:cs="Calibri"/>
-        </w:rPr>
-      </w:pPr>
-      <w:r>
-        <w:rPr>
-          <w:rStyle w:val="HTMLCode"/>
-        </w:rPr>
-        <w:t>publish()</w:t>
-      </w:r>
-      <w:r>
-        <w:t xml:space="preserve"> → </w:t>
-      </w:r>
-      <w:r>
-        <w:rPr>
-          <w:rFonts w:ascii="Calibri" w:hAnsi="Calibri" w:cs="Calibri"/>
-        </w:rPr>
-        <w:t>untuk mempublish post.</w:t>
-      </w:r>
-    </w:p>
-    <w:p>
-      <w:pPr>
-        <w:pStyle w:val="NormalWeb"/>
-        <w:numPr>
-          <w:ilvl w:val="0"/>
-          <w:numId w:val="180"/>
-        </w:numPr>
-        <w:ind w:left="851"/>
-        <w:rPr>
-          <w:rFonts w:ascii="Calibri" w:hAnsi="Calibri" w:cs="Calibri"/>
-        </w:rPr>
-      </w:pPr>
-      <w:r>
-        <w:rPr>
-          <w:rStyle w:val="HTMLCode"/>
-        </w:rPr>
-        <w:t>__str__()</w:t>
-      </w:r>
-      <w:r>
-        <w:t xml:space="preserve"> → </w:t>
-      </w:r>
-      <w:r>
-        <w:rPr>
-          <w:rFonts w:ascii="Calibri" w:hAnsi="Calibri" w:cs="Calibri"/>
-        </w:rPr>
-        <w:t>untuk menampilkan judul ketika objek dipanggil sebagai string.</w:t>
-      </w:r>
-    </w:p>
-    <w:p/>
     <w:p>
       <w:pPr>
         <w:pStyle w:val="Heading4"/>
@@ -5364,7 +5699,29 @@
           <w:iCs w:val="0"/>
           <w:color w:val="auto"/>
         </w:rPr>
-        <w:t>Langkah 6: Membuat dan Menjalankan Migrasi</w:t>
+        <w:t xml:space="preserve">Langkah </w:t>
+      </w:r>
+      <w:r>
+        <w:rPr>
+          <w:rStyle w:val="selected"/>
+          <w:b/>
+          <w:bCs/>
+          <w:i w:val="0"/>
+          <w:iCs w:val="0"/>
+          <w:color w:val="auto"/>
+        </w:rPr>
+        <w:t>7</w:t>
+      </w:r>
+      <w:r>
+        <w:rPr>
+          <w:rStyle w:val="selected"/>
+          <w:b/>
+          <w:bCs/>
+          <w:i w:val="0"/>
+          <w:iCs w:val="0"/>
+          <w:color w:val="auto"/>
+        </w:rPr>
+        <w:t>: Mendaftarkan Model ke Panel Admin</w:t>
       </w:r>
     </w:p>
     <w:p>
@@ -5372,41 +5729,84 @@
         <w:pStyle w:val="NormalWeb"/>
         <w:numPr>
           <w:ilvl w:val="0"/>
-          <w:numId w:val="171"/>
+          <w:numId w:val="172"/>
         </w:numPr>
       </w:pPr>
       <w:r>
         <w:rPr>
           <w:rStyle w:val="selected"/>
         </w:rPr>
-        <w:t>Setelah model didefinisikan, beri tahu Django untuk membuat file migrasi.</w:t>
+        <w:t xml:space="preserve">Agar kita bisa mengelola </w:t>
+      </w:r>
+      <w:r>
+        <w:rPr>
+          <w:rStyle w:val="selected"/>
+          <w:rFonts w:ascii="Courier New" w:hAnsi="Courier New" w:cs="Courier New"/>
+          <w:sz w:val="20"/>
+          <w:szCs w:val="20"/>
+        </w:rPr>
+        <w:t>Post</w:t>
+      </w:r>
+      <w:r>
+        <w:rPr>
+          <w:rStyle w:val="selected"/>
+        </w:rPr>
+        <w:t xml:space="preserve"> melalui panel admin, kita perlu mendaftarkannya. Buka </w:t>
+      </w:r>
+      <w:r>
+        <w:rPr>
+          <w:rStyle w:val="selected"/>
+        </w:rPr>
+        <w:t xml:space="preserve">file </w:t>
+      </w:r>
+      <w:r>
+        <w:rPr>
+          <w:rStyle w:val="selected"/>
+          <w:rFonts w:ascii="Courier New" w:hAnsi="Courier New" w:cs="Courier New"/>
+          <w:sz w:val="20"/>
+          <w:szCs w:val="20"/>
+        </w:rPr>
+        <w:t>blog/admin.py</w:t>
+      </w:r>
+      <w:r>
+        <w:rPr>
+          <w:rStyle w:val="selected"/>
+        </w:rPr>
+        <w:t>.</w:t>
+      </w:r>
+      <w:r>
+        <w:rPr>
+          <w:rStyle w:val="selected"/>
+        </w:rPr>
+        <w:t xml:space="preserve"> tambahkan kode berikut</w:t>
       </w:r>
     </w:p>
     <w:p>
       <w:pPr>
-        <w:pStyle w:val="ListParagraph"/>
-        <w:jc w:val="both"/>
+        <w:pStyle w:val="HTMLPreformatted"/>
+        <w:ind w:left="720"/>
         <w:rPr>
           <w:rStyle w:val="selected"/>
-          <w:rFonts w:ascii="Courier New" w:hAnsi="Courier New" w:cs="Courier New"/>
-          <w:sz w:val="22"/>
-          <w:szCs w:val="22"/>
-        </w:rPr>
-      </w:pPr>
-      <w:r>
-        <w:rPr>
-          <w:rFonts w:ascii="Courier New" w:hAnsi="Courier New" w:cs="Courier New"/>
-          <w:sz w:val="22"/>
-          <w:szCs w:val="22"/>
-        </w:rPr>
-        <w:t>Terminal</w:t>
+          <w:rFonts w:ascii="Courier New" w:hAnsi="Courier New"/>
+          <w:sz w:val="21"/>
+          <w:szCs w:val="21"/>
+        </w:rPr>
+      </w:pPr>
+      <w:r>
+        <w:rPr>
+          <w:rStyle w:val="selected"/>
+          <w:rFonts w:ascii="Courier New" w:hAnsi="Courier New"/>
+          <w:sz w:val="21"/>
+          <w:szCs w:val="21"/>
+        </w:rPr>
+        <w:t>blog/admin.py</w:t>
       </w:r>
     </w:p>
     <w:p>
       <w:pPr>
         <w:numPr>
           <w:ilvl w:val="0"/>
-          <w:numId w:val="173"/>
+          <w:numId w:val="175"/>
         </w:numPr>
         <w:pBdr>
           <w:left w:val="single" w:sz="18" w:space="0" w:color="6CE26C"/>
@@ -5443,65 +5843,30 @@
       <w:r>
         <w:rPr>
           <w:rFonts w:ascii="Consolas" w:hAnsi="Consolas" w:cs="Consolas"/>
-          <w:color w:val="5C5C5C"/>
+          <w:color w:val="A626A4"/>
           <w:sz w:val="21"/>
           <w:szCs w:val="21"/>
         </w:rPr>
-        <w:t>python manage.py makemigrations blog</w:t>
-      </w:r>
-    </w:p>
-    <w:p>
-      <w:pPr>
-        <w:pStyle w:val="NormalWeb"/>
-        <w:numPr>
-          <w:ilvl w:val="0"/>
-          <w:numId w:val="171"/>
-        </w:numPr>
-      </w:pPr>
-      <w:r>
-        <w:rPr>
-          <w:rStyle w:val="selected"/>
-        </w:rPr>
-        <w:t>Sekarang, terapkan migrasi tersebut ke basis data.</w:t>
-      </w:r>
-    </w:p>
-    <w:p>
-      <w:pPr>
-        <w:pStyle w:val="ListParagraph"/>
-        <w:jc w:val="both"/>
-        <w:rPr>
-          <w:rFonts w:ascii="Courier New" w:hAnsi="Courier New" w:cs="Courier New"/>
-          <w:sz w:val="22"/>
-          <w:szCs w:val="22"/>
-        </w:rPr>
-      </w:pPr>
-      <w:r>
-        <w:rPr>
-          <w:rFonts w:ascii="Courier New" w:hAnsi="Courier New" w:cs="Courier New"/>
-          <w:sz w:val="22"/>
-          <w:szCs w:val="22"/>
-        </w:rPr>
-        <w:t>Terminal</w:t>
-      </w:r>
-    </w:p>
-    <w:p>
-      <w:pPr>
-        <w:numPr>
-          <w:ilvl w:val="0"/>
-          <w:numId w:val="174"/>
-        </w:numPr>
-        <w:pBdr>
-          <w:left w:val="single" w:sz="18" w:space="0" w:color="6CE26C"/>
-        </w:pBdr>
-        <w:spacing w:line="270" w:lineRule="atLeast"/>
-        <w:ind w:left="1395"/>
+        <w:t>from</w:t>
+      </w:r>
+      <w:r>
         <w:rPr>
           <w:rFonts w:ascii="Consolas" w:hAnsi="Consolas" w:cs="Consolas"/>
           <w:color w:val="5C5C5C"/>
           <w:sz w:val="21"/>
           <w:szCs w:val="21"/>
         </w:rPr>
-      </w:pPr>
+        <w:t> django.contrib </w:t>
+      </w:r>
+      <w:r>
+        <w:rPr>
+          <w:rFonts w:ascii="Consolas" w:hAnsi="Consolas" w:cs="Consolas"/>
+          <w:color w:val="A626A4"/>
+          <w:sz w:val="21"/>
+          <w:szCs w:val="21"/>
+        </w:rPr>
+        <w:t>import</w:t>
+      </w:r>
       <w:r>
         <w:rPr>
           <w:rFonts w:ascii="Consolas" w:hAnsi="Consolas" w:cs="Consolas"/>
@@ -5509,158 +5874,7 @@
           <w:sz w:val="21"/>
           <w:szCs w:val="21"/>
         </w:rPr>
-        <w:t>python manage.py migrate</w:t>
-      </w:r>
-    </w:p>
-    <w:p>
-      <w:pPr>
-        <w:pStyle w:val="HTMLPreformatted"/>
-        <w:ind w:left="720"/>
-      </w:pPr>
-    </w:p>
-    <w:p>
-      <w:pPr>
-        <w:pStyle w:val="NormalWeb"/>
-        <w:ind w:left="720"/>
-      </w:pPr>
-      <w:r>
-        <w:rPr>
-          <w:rStyle w:val="selected"/>
-          <w:i/>
-          <w:iCs/>
-        </w:rPr>
-        <w:t>Basis data default Django adalah file SQLite yang akan dibuat otomatis (</w:t>
-      </w:r>
-      <w:r>
-        <w:rPr>
-          <w:rStyle w:val="selected"/>
-          <w:rFonts w:ascii="Courier New" w:hAnsi="Courier New" w:cs="Courier New"/>
-          <w:i/>
-          <w:iCs/>
-          <w:sz w:val="20"/>
-          <w:szCs w:val="20"/>
-        </w:rPr>
-        <w:t>db.sqlite3</w:t>
-      </w:r>
-      <w:r>
-        <w:rPr>
-          <w:rStyle w:val="selected"/>
-          <w:i/>
-          <w:iCs/>
-        </w:rPr>
-        <w:t>).</w:t>
-      </w:r>
-    </w:p>
-    <w:p>
-      <w:pPr>
-        <w:pStyle w:val="Heading4"/>
-        <w:rPr>
-          <w:b/>
-          <w:bCs/>
-          <w:i w:val="0"/>
-          <w:iCs w:val="0"/>
-          <w:color w:val="auto"/>
-        </w:rPr>
-      </w:pPr>
-      <w:r>
-        <w:rPr>
-          <w:rStyle w:val="selected"/>
-          <w:b/>
-          <w:bCs/>
-          <w:i w:val="0"/>
-          <w:iCs w:val="0"/>
-          <w:color w:val="auto"/>
-        </w:rPr>
-        <w:lastRenderedPageBreak/>
-        <w:t xml:space="preserve">Langkah </w:t>
-      </w:r>
-      <w:r>
-        <w:rPr>
-          <w:rStyle w:val="selected"/>
-          <w:b/>
-          <w:bCs/>
-          <w:i w:val="0"/>
-          <w:iCs w:val="0"/>
-          <w:color w:val="auto"/>
-        </w:rPr>
-        <w:t>7</w:t>
-      </w:r>
-      <w:r>
-        <w:rPr>
-          <w:rStyle w:val="selected"/>
-          <w:b/>
-          <w:bCs/>
-          <w:i w:val="0"/>
-          <w:iCs w:val="0"/>
-          <w:color w:val="auto"/>
-        </w:rPr>
-        <w:t>: Mendaftarkan Model ke Panel Admin</w:t>
-      </w:r>
-    </w:p>
-    <w:p>
-      <w:pPr>
-        <w:pStyle w:val="NormalWeb"/>
-        <w:numPr>
-          <w:ilvl w:val="0"/>
-          <w:numId w:val="172"/>
-        </w:numPr>
-      </w:pPr>
-      <w:r>
-        <w:rPr>
-          <w:rStyle w:val="selected"/>
-        </w:rPr>
-        <w:t xml:space="preserve">Agar kita bisa mengelola </w:t>
-      </w:r>
-      <w:r>
-        <w:rPr>
-          <w:rStyle w:val="selected"/>
-          <w:rFonts w:ascii="Courier New" w:hAnsi="Courier New" w:cs="Courier New"/>
-          <w:sz w:val="20"/>
-          <w:szCs w:val="20"/>
-        </w:rPr>
-        <w:t>Post</w:t>
-      </w:r>
-      <w:r>
-        <w:rPr>
-          <w:rStyle w:val="selected"/>
-        </w:rPr>
-        <w:t xml:space="preserve"> melalui panel admin, kita perlu mendaftarkannya. Buka </w:t>
-      </w:r>
-      <w:r>
-        <w:rPr>
-          <w:rStyle w:val="selected"/>
-          <w:rFonts w:ascii="Courier New" w:hAnsi="Courier New" w:cs="Courier New"/>
-          <w:sz w:val="20"/>
-          <w:szCs w:val="20"/>
-        </w:rPr>
-        <w:t>blog/admin.py</w:t>
-      </w:r>
-      <w:r>
-        <w:rPr>
-          <w:rStyle w:val="selected"/>
-        </w:rPr>
-        <w:t>.</w:t>
-      </w:r>
-    </w:p>
-    <w:p>
-      <w:pPr>
-        <w:pStyle w:val="HTMLPreformatted"/>
-        <w:ind w:left="720"/>
-        <w:rPr>
-          <w:rStyle w:val="selected"/>
-          <w:rFonts w:ascii="Courier New" w:hAnsi="Courier New"/>
-          <w:sz w:val="21"/>
-          <w:szCs w:val="21"/>
-        </w:rPr>
-      </w:pPr>
-      <w:r>
-        <w:rPr>
-          <w:rStyle w:val="selected"/>
-          <w:rFonts w:ascii="Courier New" w:hAnsi="Courier New"/>
-          <w:sz w:val="21"/>
-          <w:szCs w:val="21"/>
-        </w:rPr>
-        <w:t>blog/admin.py</w:t>
+        <w:t> admin</w:t>
       </w:r>
     </w:p>
     <w:p>
@@ -5672,7 +5886,7 @@
         <w:pBdr>
           <w:left w:val="single" w:sz="18" w:space="0" w:color="6CE26C"/>
         </w:pBdr>
-        <w:shd w:val="clear" w:color="auto" w:fill="FAFAFA"/>
+        <w:shd w:val="clear" w:color="auto" w:fill="F8F8F8"/>
         <w:tabs>
           <w:tab w:val="clear" w:pos="720"/>
           <w:tab w:val="left" w:pos="916"/>
@@ -5717,7 +5931,7 @@
           <w:sz w:val="21"/>
           <w:szCs w:val="21"/>
         </w:rPr>
-        <w:t> django.contrib </w:t>
+        <w:t> .models </w:t>
       </w:r>
       <w:r>
         <w:rPr>
@@ -5735,7 +5949,7 @@
           <w:sz w:val="21"/>
           <w:szCs w:val="21"/>
         </w:rPr>
-        <w:t> admin</w:t>
+        <w:t> Post</w:t>
       </w:r>
     </w:p>
     <w:p>
@@ -5747,7 +5961,7 @@
         <w:pBdr>
           <w:left w:val="single" w:sz="18" w:space="0" w:color="6CE26C"/>
         </w:pBdr>
-        <w:shd w:val="clear" w:color="auto" w:fill="F8F8F8"/>
+        <w:shd w:val="clear" w:color="auto" w:fill="FAFAFA"/>
         <w:tabs>
           <w:tab w:val="clear" w:pos="720"/>
           <w:tab w:val="left" w:pos="916"/>
@@ -5776,42 +5990,6 @@
           <w:szCs w:val="21"/>
         </w:rPr>
       </w:pPr>
-      <w:r>
-        <w:rPr>
-          <w:rFonts w:ascii="Consolas" w:hAnsi="Consolas" w:cs="Consolas"/>
-          <w:color w:val="A626A4"/>
-          <w:sz w:val="21"/>
-          <w:szCs w:val="21"/>
-        </w:rPr>
-        <w:t>from</w:t>
-      </w:r>
-      <w:r>
-        <w:rPr>
-          <w:rFonts w:ascii="Consolas" w:hAnsi="Consolas" w:cs="Consolas"/>
-          <w:color w:val="5C5C5C"/>
-          <w:sz w:val="21"/>
-          <w:szCs w:val="21"/>
-        </w:rPr>
-        <w:t> .models </w:t>
-      </w:r>
-      <w:r>
-        <w:rPr>
-          <w:rFonts w:ascii="Consolas" w:hAnsi="Consolas" w:cs="Consolas"/>
-          <w:color w:val="A626A4"/>
-          <w:sz w:val="21"/>
-          <w:szCs w:val="21"/>
-        </w:rPr>
-        <w:t>import</w:t>
-      </w:r>
-      <w:r>
-        <w:rPr>
-          <w:rFonts w:ascii="Consolas" w:hAnsi="Consolas" w:cs="Consolas"/>
-          <w:color w:val="5C5C5C"/>
-          <w:sz w:val="21"/>
-          <w:szCs w:val="21"/>
-        </w:rPr>
-        <w:t> Post</w:t>
-      </w:r>
     </w:p>
     <w:p>
       <w:pPr>
@@ -5822,7 +6000,7 @@
         <w:pBdr>
           <w:left w:val="single" w:sz="18" w:space="0" w:color="6CE26C"/>
         </w:pBdr>
-        <w:shd w:val="clear" w:color="auto" w:fill="FAFAFA"/>
+        <w:shd w:val="clear" w:color="auto" w:fill="F8F8F8"/>
         <w:tabs>
           <w:tab w:val="clear" w:pos="720"/>
           <w:tab w:val="left" w:pos="916"/>
@@ -5851,17 +6029,220 @@
           <w:szCs w:val="21"/>
         </w:rPr>
       </w:pPr>
+      <w:r>
+        <w:rPr>
+          <w:rFonts w:ascii="Consolas" w:hAnsi="Consolas" w:cs="Consolas"/>
+          <w:color w:val="5C5C5C"/>
+          <w:sz w:val="21"/>
+          <w:szCs w:val="21"/>
+        </w:rPr>
+        <w:t>admin.site.register(Post)</w:t>
+      </w:r>
+    </w:p>
+    <w:p/>
+    <w:p>
+      <w:pPr>
+        <w:pStyle w:val="HTMLPreformatted"/>
+        <w:ind w:left="720"/>
+      </w:pPr>
     </w:p>
     <w:p>
       <w:pPr>
+        <w:pStyle w:val="NormalWeb"/>
         <w:numPr>
           <w:ilvl w:val="0"/>
-          <w:numId w:val="175"/>
+          <w:numId w:val="172"/>
+        </w:numPr>
+      </w:pPr>
+      <w:r>
+        <w:rPr>
+          <w:rStyle w:val="selected"/>
+        </w:rPr>
+        <w:t>Buat akun superuser untuk bisa login ke panel admin.</w:t>
+      </w:r>
+    </w:p>
+    <w:p>
+      <w:pPr>
+        <w:pStyle w:val="ListParagraph"/>
+        <w:jc w:val="both"/>
+        <w:rPr>
+          <w:rFonts w:ascii="Courier New" w:hAnsi="Courier New" w:cs="Courier New"/>
+          <w:sz w:val="22"/>
+          <w:szCs w:val="22"/>
+        </w:rPr>
+      </w:pPr>
+      <w:r>
+        <w:rPr>
+          <w:rFonts w:ascii="Courier New" w:hAnsi="Courier New" w:cs="Courier New"/>
+          <w:sz w:val="22"/>
+          <w:szCs w:val="22"/>
+        </w:rPr>
+        <w:t>Terminal</w:t>
+      </w:r>
+    </w:p>
+    <w:p>
+      <w:pPr>
+        <w:numPr>
+          <w:ilvl w:val="0"/>
+          <w:numId w:val="176"/>
         </w:numPr>
         <w:pBdr>
           <w:left w:val="single" w:sz="18" w:space="0" w:color="6CE26C"/>
         </w:pBdr>
-        <w:shd w:val="clear" w:color="auto" w:fill="F8F8F8"/>
+        <w:spacing w:line="270" w:lineRule="atLeast"/>
+        <w:ind w:left="1395"/>
+        <w:rPr>
+          <w:rFonts w:ascii="Consolas" w:hAnsi="Consolas" w:cs="Consolas"/>
+          <w:color w:val="5C5C5C"/>
+          <w:sz w:val="21"/>
+          <w:szCs w:val="21"/>
+        </w:rPr>
+      </w:pPr>
+      <w:r>
+        <w:rPr>
+          <w:rFonts w:ascii="Consolas" w:hAnsi="Consolas" w:cs="Consolas"/>
+          <w:color w:val="5C5C5C"/>
+          <w:sz w:val="21"/>
+          <w:szCs w:val="21"/>
+        </w:rPr>
+        <w:t>python manage.py createsuperuser</w:t>
+      </w:r>
+    </w:p>
+    <w:p>
+      <w:pPr>
+        <w:pStyle w:val="HTMLPreformatted"/>
+        <w:ind w:left="720"/>
+      </w:pPr>
+    </w:p>
+    <w:p>
+      <w:pPr>
+        <w:pStyle w:val="NormalWeb"/>
+        <w:ind w:left="720"/>
+        <w:rPr>
+          <w:rStyle w:val="selected"/>
+          <w:i/>
+          <w:iCs/>
+        </w:rPr>
+      </w:pPr>
+      <w:r>
+        <w:rPr>
+          <w:rStyle w:val="selected"/>
+          <w:i/>
+          <w:iCs/>
+        </w:rPr>
+        <w:t>Ikuti prompt untuk membuat username, email, dan password.</w:t>
+      </w:r>
+    </w:p>
+    <w:p>
+      <w:pPr>
+        <w:pStyle w:val="NormalWeb"/>
+        <w:ind w:left="720"/>
+        <w:rPr>
+          <w:rStyle w:val="selected"/>
+        </w:rPr>
+      </w:pPr>
+      <w:r>
+        <w:rPr>
+          <w:rStyle w:val="selected"/>
+        </w:rPr>
+        <w:t>Username : admin</w:t>
+      </w:r>
+    </w:p>
+    <w:p>
+      <w:pPr>
+        <w:pStyle w:val="NormalWeb"/>
+        <w:ind w:left="720"/>
+        <w:rPr>
+          <w:rStyle w:val="selected"/>
+        </w:rPr>
+      </w:pPr>
+      <w:r>
+        <w:rPr>
+          <w:rStyle w:val="selected"/>
+        </w:rPr>
+        <w:t xml:space="preserve">Email : </w:t>
+      </w:r>
+      <w:hyperlink r:id="rId12" w:history="1">
+        <w:r>
+          <w:rPr>
+            <w:rStyle w:val="Hyperlink"/>
+            <w:rFonts w:asciiTheme="minorHAnsi" w:hAnsiTheme="minorHAnsi"/>
+          </w:rPr>
+          <w:t>admin@admin.com</w:t>
+        </w:r>
+      </w:hyperlink>
+    </w:p>
+    <w:p>
+      <w:pPr>
+        <w:pStyle w:val="NormalWeb"/>
+        <w:ind w:left="720"/>
+      </w:pPr>
+      <w:r>
+        <w:rPr>
+          <w:rStyle w:val="selected"/>
+        </w:rPr>
+        <w:t>Password : 4dm1nptiums123</w:t>
+      </w:r>
+    </w:p>
+    <w:p>
+      <w:pPr>
+        <w:pStyle w:val="NormalWeb"/>
+        <w:numPr>
+          <w:ilvl w:val="0"/>
+          <w:numId w:val="172"/>
+        </w:numPr>
+      </w:pPr>
+      <w:r>
+        <w:rPr>
+          <w:rStyle w:val="selected"/>
+        </w:rPr>
+        <w:t xml:space="preserve">Jalankan kembali server dan kunjungi </w:t>
+      </w:r>
+      <w:r>
+        <w:rPr>
+          <w:rStyle w:val="selected"/>
+          <w:rFonts w:ascii="Courier New" w:hAnsi="Courier New" w:cs="Courier New"/>
+          <w:sz w:val="20"/>
+          <w:szCs w:val="20"/>
+        </w:rPr>
+        <w:t>http://127.0.0.1:8000/admin/</w:t>
+      </w:r>
+      <w:r>
+        <w:rPr>
+          <w:rStyle w:val="selected"/>
+        </w:rPr>
+        <w:t>. Login dengan akun yang baru saja Anda buat</w:t>
+      </w:r>
+    </w:p>
+    <w:p>
+      <w:pPr>
+        <w:pStyle w:val="ListParagraph"/>
+        <w:jc w:val="both"/>
+        <w:rPr>
+          <w:rFonts w:ascii="Courier New" w:hAnsi="Courier New" w:cs="Courier New"/>
+          <w:sz w:val="22"/>
+          <w:szCs w:val="22"/>
+        </w:rPr>
+      </w:pPr>
+      <w:r>
+        <w:rPr>
+          <w:rFonts w:ascii="Courier New" w:hAnsi="Courier New" w:cs="Courier New"/>
+          <w:sz w:val="22"/>
+          <w:szCs w:val="22"/>
+        </w:rPr>
+        <w:t>Terminal</w:t>
+      </w:r>
+    </w:p>
+    <w:p>
+      <w:pPr>
+        <w:numPr>
+          <w:ilvl w:val="0"/>
+          <w:numId w:val="177"/>
+        </w:numPr>
+        <w:pBdr>
+          <w:left w:val="single" w:sz="18" w:space="0" w:color="6CE26C"/>
+        </w:pBdr>
+        <w:shd w:val="clear" w:color="auto" w:fill="FAFAFA"/>
         <w:tabs>
           <w:tab w:val="clear" w:pos="720"/>
           <w:tab w:val="left" w:pos="916"/>
@@ -5882,7 +6263,6 @@
           <w:tab w:val="left" w:pos="14656"/>
         </w:tabs>
         <w:spacing w:line="270" w:lineRule="atLeast"/>
-        <w:ind w:left="1395"/>
         <w:rPr>
           <w:rFonts w:ascii="Consolas" w:hAnsi="Consolas" w:cs="Consolas"/>
           <w:color w:val="5C5C5C"/>
@@ -5897,274 +6277,6 @@
           <w:sz w:val="21"/>
           <w:szCs w:val="21"/>
         </w:rPr>
-        <w:t>admin.site.register(Post)</w:t>
-      </w:r>
-    </w:p>
-    <w:p/>
-    <w:p>
-      <w:pPr>
-        <w:pStyle w:val="HTMLPreformatted"/>
-        <w:ind w:left="720"/>
-      </w:pPr>
-    </w:p>
-    <w:p>
-      <w:pPr>
-        <w:pStyle w:val="NormalWeb"/>
-        <w:numPr>
-          <w:ilvl w:val="0"/>
-          <w:numId w:val="172"/>
-        </w:numPr>
-      </w:pPr>
-      <w:r>
-        <w:rPr>
-          <w:rStyle w:val="selected"/>
-        </w:rPr>
-        <w:t>Buat akun superuser untuk bisa login ke panel admin.</w:t>
-      </w:r>
-    </w:p>
-    <w:p>
-      <w:pPr>
-        <w:pStyle w:val="ListParagraph"/>
-        <w:jc w:val="both"/>
-        <w:rPr>
-          <w:rFonts w:ascii="Courier New" w:hAnsi="Courier New" w:cs="Courier New"/>
-          <w:sz w:val="22"/>
-          <w:szCs w:val="22"/>
-        </w:rPr>
-      </w:pPr>
-      <w:r>
-        <w:rPr>
-          <w:rFonts w:ascii="Courier New" w:hAnsi="Courier New" w:cs="Courier New"/>
-          <w:sz w:val="22"/>
-          <w:szCs w:val="22"/>
-        </w:rPr>
-        <w:t>Terminal</w:t>
-      </w:r>
-    </w:p>
-    <w:p>
-      <w:pPr>
-        <w:numPr>
-          <w:ilvl w:val="0"/>
-          <w:numId w:val="176"/>
-        </w:numPr>
-        <w:pBdr>
-          <w:left w:val="single" w:sz="18" w:space="0" w:color="6CE26C"/>
-        </w:pBdr>
-        <w:spacing w:line="270" w:lineRule="atLeast"/>
-        <w:ind w:left="1395"/>
-        <w:rPr>
-          <w:rFonts w:ascii="Consolas" w:hAnsi="Consolas" w:cs="Consolas"/>
-          <w:color w:val="5C5C5C"/>
-          <w:sz w:val="21"/>
-          <w:szCs w:val="21"/>
-        </w:rPr>
-      </w:pPr>
-      <w:r>
-        <w:rPr>
-          <w:rFonts w:ascii="Consolas" w:hAnsi="Consolas" w:cs="Consolas"/>
-          <w:color w:val="5C5C5C"/>
-          <w:sz w:val="21"/>
-          <w:szCs w:val="21"/>
-        </w:rPr>
-        <w:t>python manage.py createsuperuser</w:t>
-      </w:r>
-    </w:p>
-    <w:p>
-      <w:pPr>
-        <w:pStyle w:val="HTMLPreformatted"/>
-        <w:ind w:left="720"/>
-      </w:pPr>
-    </w:p>
-    <w:p>
-      <w:pPr>
-        <w:pStyle w:val="NormalWeb"/>
-        <w:ind w:left="720"/>
-        <w:rPr>
-          <w:rStyle w:val="selected"/>
-          <w:i/>
-          <w:iCs/>
-        </w:rPr>
-      </w:pPr>
-      <w:r>
-        <w:rPr>
-          <w:rStyle w:val="selected"/>
-          <w:i/>
-          <w:iCs/>
-        </w:rPr>
-        <w:t>Ikuti prompt untuk membuat username, email, dan password.</w:t>
-      </w:r>
-    </w:p>
-    <w:p>
-      <w:pPr>
-        <w:pStyle w:val="NormalWeb"/>
-        <w:ind w:left="720"/>
-        <w:rPr>
-          <w:rStyle w:val="selected"/>
-          <w:i/>
-          <w:iCs/>
-        </w:rPr>
-      </w:pPr>
-      <w:r>
-        <w:rPr>
-          <w:rStyle w:val="selected"/>
-          <w:i/>
-          <w:iCs/>
-        </w:rPr>
-        <w:t>Username : admin</w:t>
-      </w:r>
-    </w:p>
-    <w:p>
-      <w:pPr>
-        <w:pStyle w:val="NormalWeb"/>
-        <w:ind w:left="720"/>
-        <w:rPr>
-          <w:rStyle w:val="selected"/>
-          <w:i/>
-          <w:iCs/>
-        </w:rPr>
-      </w:pPr>
-      <w:r>
-        <w:rPr>
-          <w:rStyle w:val="selected"/>
-          <w:i/>
-          <w:iCs/>
-        </w:rPr>
-        <w:t xml:space="preserve">Email : </w:t>
-      </w:r>
-      <w:hyperlink r:id="rId12" w:history="1">
-        <w:r>
-          <w:rPr>
-            <w:rStyle w:val="Hyperlink"/>
-            <w:rFonts w:asciiTheme="minorHAnsi" w:hAnsiTheme="minorHAnsi"/>
-            <w:i/>
-            <w:iCs/>
-          </w:rPr>
-          <w:t>admin@admin.com</w:t>
-        </w:r>
-      </w:hyperlink>
-    </w:p>
-    <w:p>
-      <w:pPr>
-        <w:pStyle w:val="NormalWeb"/>
-        <w:ind w:left="720"/>
-      </w:pPr>
-      <w:r>
-        <w:rPr>
-          <w:rStyle w:val="selected"/>
-          <w:i/>
-          <w:iCs/>
-        </w:rPr>
-        <w:t>Password : 4dm1nptiums123</w:t>
-      </w:r>
-    </w:p>
-    <w:p>
-      <w:pPr>
-        <w:pStyle w:val="NormalWeb"/>
-        <w:numPr>
-          <w:ilvl w:val="0"/>
-          <w:numId w:val="172"/>
-        </w:numPr>
-      </w:pPr>
-      <w:r>
-        <w:rPr>
-          <w:rStyle w:val="selected"/>
-        </w:rPr>
-        <w:t>Jalankan kembali server (</w:t>
-      </w:r>
-      <w:r>
-        <w:rPr>
-          <w:rStyle w:val="selected"/>
-          <w:rFonts w:ascii="Courier New" w:hAnsi="Courier New" w:cs="Courier New"/>
-          <w:sz w:val="20"/>
-          <w:szCs w:val="20"/>
-        </w:rPr>
-        <w:t>python manage.py runserver</w:t>
-      </w:r>
-      <w:r>
-        <w:rPr>
-          <w:rStyle w:val="selected"/>
-        </w:rPr>
-        <w:t xml:space="preserve">) dan kunjungi </w:t>
-      </w:r>
-      <w:r>
-        <w:rPr>
-          <w:rStyle w:val="selected"/>
-          <w:rFonts w:ascii="Courier New" w:hAnsi="Courier New" w:cs="Courier New"/>
-          <w:sz w:val="20"/>
-          <w:szCs w:val="20"/>
-        </w:rPr>
-        <w:t>http://127.0.0.1:8000/admin/</w:t>
-      </w:r>
-      <w:r>
-        <w:rPr>
-          <w:rStyle w:val="selected"/>
-        </w:rPr>
-        <w:t>. Login dengan akun yang baru saja Anda buat</w:t>
-      </w:r>
-    </w:p>
-    <w:p>
-      <w:pPr>
-        <w:pStyle w:val="ListParagraph"/>
-        <w:jc w:val="both"/>
-        <w:rPr>
-          <w:rFonts w:ascii="Courier New" w:hAnsi="Courier New" w:cs="Courier New"/>
-          <w:sz w:val="22"/>
-          <w:szCs w:val="22"/>
-        </w:rPr>
-      </w:pPr>
-      <w:r>
-        <w:rPr>
-          <w:rFonts w:ascii="Courier New" w:hAnsi="Courier New" w:cs="Courier New"/>
-          <w:sz w:val="22"/>
-          <w:szCs w:val="22"/>
-        </w:rPr>
-        <w:t>Terminal</w:t>
-      </w:r>
-    </w:p>
-    <w:p>
-      <w:pPr>
-        <w:numPr>
-          <w:ilvl w:val="0"/>
-          <w:numId w:val="177"/>
-        </w:numPr>
-        <w:pBdr>
-          <w:left w:val="single" w:sz="18" w:space="0" w:color="6CE26C"/>
-        </w:pBdr>
-        <w:shd w:val="clear" w:color="auto" w:fill="FAFAFA"/>
-        <w:tabs>
-          <w:tab w:val="clear" w:pos="720"/>
-          <w:tab w:val="left" w:pos="916"/>
-          <w:tab w:val="left" w:pos="1832"/>
-          <w:tab w:val="left" w:pos="2748"/>
-          <w:tab w:val="left" w:pos="3664"/>
-          <w:tab w:val="left" w:pos="4580"/>
-          <w:tab w:val="left" w:pos="5496"/>
-          <w:tab w:val="left" w:pos="6412"/>
-          <w:tab w:val="left" w:pos="7328"/>
-          <w:tab w:val="left" w:pos="8244"/>
-          <w:tab w:val="left" w:pos="9160"/>
-          <w:tab w:val="left" w:pos="10076"/>
-          <w:tab w:val="left" w:pos="10992"/>
-          <w:tab w:val="left" w:pos="11908"/>
-          <w:tab w:val="left" w:pos="12824"/>
-          <w:tab w:val="left" w:pos="13740"/>
-          <w:tab w:val="left" w:pos="14656"/>
-        </w:tabs>
-        <w:spacing w:line="270" w:lineRule="atLeast"/>
-        <w:rPr>
-          <w:rFonts w:ascii="Consolas" w:hAnsi="Consolas" w:cs="Consolas"/>
-          <w:color w:val="5C5C5C"/>
-          <w:sz w:val="21"/>
-          <w:szCs w:val="21"/>
-        </w:rPr>
-      </w:pPr>
-      <w:r>
-        <w:rPr>
-          <w:rFonts w:ascii="Consolas" w:hAnsi="Consolas" w:cs="Consolas"/>
-          <w:color w:val="5C5C5C"/>
-          <w:sz w:val="21"/>
-          <w:szCs w:val="21"/>
-        </w:rPr>
         <w:t>python manage.py runserver</w:t>
       </w:r>
     </w:p>
@@ -6190,7 +6302,7 @@
     <w:p>
       <w:pPr>
         <w:ind w:left="720"/>
-        <w:jc w:val="both"/>
+        <w:jc w:val="center"/>
         <w:rPr>
           <w:rStyle w:val="selected"/>
           <w:rFonts w:ascii="Times New Roman" w:hAnsi="Times New Roman"/>
@@ -6204,12 +6316,13 @@
           <w:rFonts w:ascii="Times New Roman" w:hAnsi="Times New Roman"/>
           <w:b/>
           <w:bCs/>
+          <w:noProof/>
         </w:rPr>
         <w:lastRenderedPageBreak/>
         <w:drawing>
-          <wp:inline distT="0" distB="0" distL="0" distR="0" wp14:anchorId="4B2C7916" wp14:editId="7AD60BDF">
-            <wp:extent cx="4953691" cy="4572638"/>
-            <wp:effectExtent l="0" t="0" r="0" b="0"/>
+          <wp:inline distT="0" distB="0" distL="0" distR="0" wp14:anchorId="4B2C7916" wp14:editId="4DD4AB1E">
+            <wp:extent cx="3147060" cy="2904978"/>
+            <wp:effectExtent l="63500" t="63500" r="129540" b="130810"/>
             <wp:docPr id="753967847" name="Picture 1" descr="A screenshot of a login form&#10;&#10;AI-generated content may be incorrect."/>
             <wp:cNvGraphicFramePr>
               <a:graphicFrameLocks xmlns:a="http://schemas.openxmlformats.org/drawingml/2006/main" noChangeAspect="1"/>
@@ -6230,11 +6343,25 @@
                   <pic:spPr>
                     <a:xfrm>
                       <a:off x="0" y="0"/>
-                      <a:ext cx="4953691" cy="4572638"/>
+                      <a:ext cx="3164333" cy="2920923"/>
                     </a:xfrm>
                     <a:prstGeom prst="rect">
                       <a:avLst/>
                     </a:prstGeom>
+                    <a:ln w="38100" cap="sq">
+                      <a:solidFill>
+                        <a:srgbClr val="000000"/>
+                      </a:solidFill>
+                      <a:prstDash val="solid"/>
+                      <a:miter lim="800000"/>
+                    </a:ln>
+                    <a:effectLst>
+                      <a:outerShdw blurRad="50800" dist="38100" dir="2700000" algn="tl" rotWithShape="0">
+                        <a:srgbClr val="000000">
+                          <a:alpha val="43000"/>
+                        </a:srgbClr>
+                      </a:outerShdw>
+                    </a:effectLst>
                   </pic:spPr>
                 </pic:pic>
               </a:graphicData>
@@ -6265,25 +6392,103 @@
         <w:jc w:val="both"/>
         <w:rPr>
           <w:rStyle w:val="selected"/>
-          <w:rFonts w:ascii="Times New Roman" w:hAnsi="Times New Roman"/>
-          <w:b/>
-          <w:bCs/>
-        </w:rPr>
-      </w:pPr>
-      <w:r>
+          <w:rFonts w:ascii="Calibri" w:hAnsi="Calibri" w:cs="Calibri"/>
+        </w:rPr>
+      </w:pPr>
+      <w:r>
+        <w:rPr>
+          <w:rStyle w:val="selected"/>
+          <w:rFonts w:ascii="Calibri" w:hAnsi="Calibri" w:cs="Calibri"/>
+        </w:rPr>
+        <w:t xml:space="preserve">Klik tombol </w:t>
+      </w:r>
+      <w:r>
+        <w:rPr>
+          <w:rStyle w:val="selected"/>
+          <w:rFonts w:ascii="Courier New" w:hAnsi="Courier New" w:cs="Courier New"/>
+        </w:rPr>
+        <w:t>+Add</w:t>
+      </w:r>
+      <w:r>
+        <w:rPr>
+          <w:rStyle w:val="selected"/>
+          <w:rFonts w:ascii="Calibri" w:hAnsi="Calibri" w:cs="Calibri"/>
+        </w:rPr>
+        <w:t xml:space="preserve"> pada </w:t>
+      </w:r>
+      <w:r>
+        <w:rPr>
+          <w:rStyle w:val="selected"/>
+          <w:rFonts w:ascii="Courier New" w:hAnsi="Courier New" w:cs="Courier New"/>
+        </w:rPr>
+        <w:t>Posts</w:t>
+      </w:r>
+      <w:r>
+        <w:rPr>
+          <w:rStyle w:val="selected"/>
+          <w:rFonts w:ascii="Calibri" w:hAnsi="Calibri" w:cs="Calibri"/>
+        </w:rPr>
+        <w:t xml:space="preserve"> kemudian buatlah 3 isian postingan untuk blog kita. </w:t>
+      </w:r>
+      <w:r>
+        <w:rPr>
+          <w:rStyle w:val="selected"/>
+          <w:rFonts w:ascii="Calibri" w:hAnsi="Calibri" w:cs="Calibri"/>
+        </w:rPr>
+        <w:t xml:space="preserve">Jangan lupa klik </w:t>
+      </w:r>
+      <w:r>
+        <w:rPr>
+          <w:rStyle w:val="selected"/>
+          <w:rFonts w:ascii="Calibri" w:hAnsi="Calibri" w:cs="Calibri"/>
+        </w:rPr>
+        <w:t xml:space="preserve"> </w:t>
+      </w:r>
+      <w:r>
+        <w:rPr>
+          <w:rStyle w:val="selected"/>
+          <w:rFonts w:ascii="Courier New" w:hAnsi="Courier New" w:cs="Courier New"/>
+        </w:rPr>
+        <w:t>Save</w:t>
+      </w:r>
+      <w:r>
+        <w:rPr>
+          <w:rStyle w:val="selected"/>
+          <w:rFonts w:ascii="Calibri" w:hAnsi="Calibri" w:cs="Calibri"/>
+        </w:rPr>
+        <w:t xml:space="preserve"> setiap kali selesai </w:t>
+      </w:r>
+      <w:r>
+        <w:rPr>
+          <w:rStyle w:val="selected"/>
+          <w:rFonts w:ascii="Calibri" w:hAnsi="Calibri" w:cs="Calibri"/>
+        </w:rPr>
+        <w:t>membuat postingan blog</w:t>
+      </w:r>
+      <w:r>
+        <w:rPr>
+          <w:rStyle w:val="selected"/>
+          <w:rFonts w:ascii="Calibri" w:hAnsi="Calibri" w:cs="Calibri"/>
+        </w:rPr>
+        <w:t>.</w:t>
+      </w:r>
+    </w:p>
+    <w:p>
+      <w:pPr>
+        <w:pStyle w:val="ListParagraph"/>
+        <w:jc w:val="both"/>
         <w:rPr>
           <w:rStyle w:val="selected"/>
           <w:rFonts w:ascii="Times New Roman" w:hAnsi="Times New Roman"/>
           <w:b/>
           <w:bCs/>
         </w:rPr>
-        <w:t>post baru</w:t>
-      </w:r>
+      </w:pPr>
     </w:p>
     <w:p>
       <w:pPr>
         <w:pStyle w:val="ListParagraph"/>
-        <w:jc w:val="both"/>
+        <w:jc w:val="center"/>
         <w:rPr>
           <w:rStyle w:val="selected"/>
           <w:rFonts w:ascii="Times New Roman" w:hAnsi="Times New Roman"/>
@@ -6297,67 +6502,12 @@
           <w:rFonts w:ascii="Times New Roman" w:hAnsi="Times New Roman"/>
           <w:b/>
           <w:bCs/>
+          <w:noProof/>
         </w:rPr>
         <w:drawing>
-          <wp:inline distT="0" distB="0" distL="0" distR="0" wp14:anchorId="41093502" wp14:editId="3EC87505">
-            <wp:extent cx="5731510" cy="2653030"/>
-            <wp:effectExtent l="0" t="0" r="2540" b="0"/>
-            <wp:docPr id="2062260531" name="Picture 1" descr="A screenshot of a computer&#10;&#10;AI-generated content may be incorrect."/>
-            <wp:cNvGraphicFramePr>
-              <a:graphicFrameLocks xmlns:a="http://schemas.openxmlformats.org/drawingml/2006/main" noChangeAspect="1"/>
-            </wp:cNvGraphicFramePr>
-            <a:graphic xmlns:a="http://schemas.openxmlformats.org/drawingml/2006/main">
-              <a:graphicData uri="http://schemas.openxmlformats.org/drawingml/2006/picture">
-                <pic:pic xmlns:pic="http://schemas.openxmlformats.org/drawingml/2006/picture">
-                  <pic:nvPicPr>
-                    <pic:cNvPr id="2062260531" name="Picture 1" descr="A screenshot of a computer&#10;&#10;AI-generated content may be incorrect."/>
-                    <pic:cNvPicPr/>
-                  </pic:nvPicPr>
-                  <pic:blipFill>
-                    <a:blip r:embed="rId14"/>
-                    <a:stretch>
-                      <a:fillRect/>
-                    </a:stretch>
-                  </pic:blipFill>
-                  <pic:spPr>
-                    <a:xfrm>
-                      <a:off x="0" y="0"/>
-                      <a:ext cx="5731510" cy="2653030"/>
-                    </a:xfrm>
-                    <a:prstGeom prst="rect">
-                      <a:avLst/>
-                    </a:prstGeom>
-                  </pic:spPr>
-                </pic:pic>
-              </a:graphicData>
-            </a:graphic>
-          </wp:inline>
-        </w:drawing>
-      </w:r>
-    </w:p>
-    <w:p>
-      <w:pPr>
-        <w:pStyle w:val="ListParagraph"/>
-        <w:jc w:val="both"/>
-        <w:rPr>
-          <w:rStyle w:val="selected"/>
-          <w:rFonts w:ascii="Times New Roman" w:hAnsi="Times New Roman"/>
-          <w:b/>
-          <w:bCs/>
-        </w:rPr>
-      </w:pPr>
-      <w:r>
-        <w:rPr>
-          <w:rStyle w:val="selected"/>
-          <w:rFonts w:ascii="Times New Roman" w:hAnsi="Times New Roman"/>
-          <w:b/>
-          <w:bCs/>
-        </w:rPr>
-        <w:lastRenderedPageBreak/>
-        <w:drawing>
-          <wp:inline distT="0" distB="0" distL="0" distR="0" wp14:anchorId="3AC57FC0" wp14:editId="026678FD">
-            <wp:extent cx="5731510" cy="4114165"/>
-            <wp:effectExtent l="0" t="0" r="2540" b="635"/>
+          <wp:inline distT="0" distB="0" distL="0" distR="0" wp14:anchorId="3AC57FC0" wp14:editId="546DC6F6">
+            <wp:extent cx="4781623" cy="3432322"/>
+            <wp:effectExtent l="63500" t="63500" r="120650" b="123825"/>
             <wp:docPr id="1290591945" name="Picture 1" descr="A screenshot of a computer&#10;&#10;AI-generated content may be incorrect."/>
             <wp:cNvGraphicFramePr>
               <a:graphicFrameLocks xmlns:a="http://schemas.openxmlformats.org/drawingml/2006/main" noChangeAspect="1"/>
@@ -6370,7 +6520,7 @@
                     <pic:cNvPicPr/>
                   </pic:nvPicPr>
                   <pic:blipFill>
-                    <a:blip r:embed="rId15"/>
+                    <a:blip r:embed="rId14"/>
                     <a:stretch>
                       <a:fillRect/>
                     </a:stretch>
@@ -6378,11 +6528,25 @@
                   <pic:spPr>
                     <a:xfrm>
                       <a:off x="0" y="0"/>
-                      <a:ext cx="5731510" cy="4114165"/>
+                      <a:ext cx="4801228" cy="3446395"/>
                     </a:xfrm>
                     <a:prstGeom prst="rect">
                       <a:avLst/>
                     </a:prstGeom>
+                    <a:ln w="38100" cap="sq">
+                      <a:solidFill>
+                        <a:srgbClr val="000000"/>
+                      </a:solidFill>
+                      <a:prstDash val="solid"/>
+                      <a:miter lim="800000"/>
+                    </a:ln>
+                    <a:effectLst>
+                      <a:outerShdw blurRad="50800" dist="38100" dir="2700000" algn="tl" rotWithShape="0">
+                        <a:srgbClr val="000000">
+                          <a:alpha val="43000"/>
+                        </a:srgbClr>
+                      </a:outerShdw>
+                    </a:effectLst>
                   </pic:spPr>
                 </pic:pic>
               </a:graphicData>
@@ -6390,6 +6554,18 @@
           </wp:inline>
         </w:drawing>
       </w:r>
+    </w:p>
+    <w:p>
+      <w:pPr>
+        <w:pStyle w:val="ListParagraph"/>
+        <w:jc w:val="both"/>
+        <w:rPr>
+          <w:rStyle w:val="selected"/>
+          <w:rFonts w:ascii="Times New Roman" w:hAnsi="Times New Roman"/>
+          <w:b/>
+          <w:bCs/>
+        </w:rPr>
+      </w:pPr>
     </w:p>
     <w:p>
       <w:pPr>
@@ -6484,6 +6660,7 @@
         <w:rPr>
           <w:rFonts w:ascii="Calibri" w:hAnsi="Calibri" w:cs="Calibri"/>
         </w:rPr>
+        <w:lastRenderedPageBreak/>
         <w:t>Model (</w:t>
       </w:r>
       <w:r>
@@ -6844,8 +7021,8 @@
       </w:pPr>
     </w:p>
     <w:sectPr>
-      <w:footerReference w:type="even" r:id="rId16"/>
-      <w:footerReference w:type="default" r:id="rId17"/>
+      <w:footerReference w:type="even" r:id="rId15"/>
+      <w:footerReference w:type="default" r:id="rId16"/>
       <w:pgSz w:w="11906" w:h="16838"/>
       <w:pgMar w:top="1440" w:right="1440" w:bottom="1440" w:left="1440" w:header="708" w:footer="708" w:gutter="0"/>
       <w:cols w:space="708"/>

</xml_diff>